<commit_message>
minor changes, added citation/licence/readme
</commit_message>
<xml_diff>
--- a/manuscript/manuscript.docx
+++ b/manuscript/manuscript.docx
@@ -224,6 +224,15 @@
         <w:t xml:space="preserve">(Miles et al., 2015)</w:t>
       </w:r>
       <w:r>
+        <w:t xml:space="preserve">. In fact, pre-breeders can make up more than half the population size, and their disappearance can have strong impacts on population health</w:t>
+      </w:r>
+      <w:r>
+        <w:t xml:space="preserve"> </w:t>
+      </w:r>
+      <w:r>
+        <w:t xml:space="preserve">(Taylor &amp; Gnam, 2026)</w:t>
+      </w:r>
+      <w:r>
         <w:t xml:space="preserve">.</w:t>
       </w:r>
     </w:p>
@@ -239,7 +248,7 @@
           <w:i/>
           <w:iCs/>
         </w:rPr>
-        <w:t xml:space="preserve">Fratecula arctica</w:t>
+        <w:t xml:space="preserve">Fratercula arctica</w:t>
       </w:r>
       <w:r>
         <w:t xml:space="preserve">; hereafter</w:t>
@@ -606,6 +615,23 @@
     <w:p>
       <w:pPr>
         <w:pStyle w:val="FirstParagraph"/>
+      </w:pPr>
+      <w:r>
+        <w:t xml:space="preserve">Ethics statement: all birds were legally harvested</w:t>
+      </w:r>
+      <w:r>
+        <w:t xml:space="preserve"> </w:t>
+      </w:r>
+      <w:r>
+        <w:t xml:space="preserve">(Løgtingslóg Um Fuglaveiðu, Sum Seinast Broytt Við Løgtingslóg Nr. 70 Frá 22. Mai 2023, 1984)</w:t>
+      </w:r>
+      <w:r>
+        <w:t xml:space="preserve">, and none of the birds were killed on request specially for this study.</w:t>
+      </w:r>
+    </w:p>
+    <w:p>
+      <w:pPr>
+        <w:pStyle w:val="BodyText"/>
       </w:pPr>
       <w:r>
         <w:t xml:space="preserve">Between 1989 and 2008, J-KJ inspected 5472 randomly selected puffins harvested on the islands of Nólsoy from 1989 to 2006, and on Mykines from 2007 and 2008 (</w:t>
@@ -993,6 +1019,14 @@
         <w:t xml:space="preserve">As a robustness check, we tested whether brood patch detectability drifted over time within confirmed breeding-age females, with a second GLM with brood patch presence as response variable and year as covariate, including only breeding-age females (n = 469). We used the same priors as for the full model, excluding the interaction term. As a second robustness check to confirm that the low sample size (n = 5) in 2007 did not have an undue effect on the overall outcome, we refit the full model excluding 2007.</w:t>
       </w:r>
     </w:p>
+    <w:p>
+      <w:pPr>
+        <w:pStyle w:val="BodyText"/>
+      </w:pPr>
+      <w:r>
+        <w:t xml:space="preserve">All data and R code is available on github:</w:t>
+      </w:r>
+    </w:p>
     <w:bookmarkEnd w:id="11"/>
     <w:bookmarkStart w:id="12" w:name="results"/>
     <w:p>
@@ -1386,17 +1420,75 @@
       </w:r>
     </w:p>
     <w:bookmarkEnd w:id="14"/>
-    <w:bookmarkStart w:id="96" w:name="references"/>
+    <w:bookmarkStart w:id="15" w:name="author-contributions"/>
     <w:p>
       <w:pPr>
         <w:pStyle w:val="Heading1"/>
       </w:pPr>
       <w:r>
+        <w:t xml:space="preserve">Author contributions</w:t>
+      </w:r>
+    </w:p>
+    <w:p>
+      <w:pPr>
+        <w:pStyle w:val="FirstParagraph"/>
+      </w:pPr>
+      <w:r>
+        <w:t xml:space="preserve">AA: conceptualisation; data curation; formal analysis; methodology; validation; visualisation; writing - original draft</w:t>
+      </w:r>
+    </w:p>
+    <w:p>
+      <w:pPr>
+        <w:pStyle w:val="BodyText"/>
+      </w:pPr>
+      <w:r>
+        <w:t xml:space="preserve">JKJ: conceptualisation; data curation; investigation; methodology; resources; writing - review and editing</w:t>
+      </w:r>
+    </w:p>
+    <w:bookmarkEnd w:id="15"/>
+    <w:bookmarkStart w:id="17" w:name="data-and-code-availability"/>
+    <w:p>
+      <w:pPr>
+        <w:pStyle w:val="Heading1"/>
+      </w:pPr>
+      <w:r>
+        <w:t xml:space="preserve">Data and code availability</w:t>
+      </w:r>
+    </w:p>
+    <w:p>
+      <w:pPr>
+        <w:pStyle w:val="FirstParagraph"/>
+      </w:pPr>
+      <w:r>
+        <w:t xml:space="preserve">Data and code for all analyses are available at</w:t>
+      </w:r>
+      <w:r>
+        <w:t xml:space="preserve"> </w:t>
+      </w:r>
+      <w:hyperlink r:id="rId16">
+        <w:r>
+          <w:rPr>
+            <w:rStyle w:val="Hyperlink"/>
+          </w:rPr>
+          <w:t xml:space="preserve">https://github.com/AnneAus/puffin_female_harvest</w:t>
+        </w:r>
+      </w:hyperlink>
+      <w:r>
+        <w:t xml:space="preserve">, archived at Zenodo: [DOI TBD].</w:t>
+      </w:r>
+    </w:p>
+    <w:bookmarkEnd w:id="17"/>
+    <w:bookmarkStart w:id="101" w:name="references"/>
+    <w:p>
+      <w:pPr>
+        <w:pStyle w:val="Heading1"/>
+      </w:pPr>
+      <w:r>
         <w:t xml:space="preserve">REFERENCES</w:t>
       </w:r>
     </w:p>
-    <w:bookmarkStart w:id="73" w:name="refs"/>
-    <w:bookmarkStart w:id="16" w:name="ref-ashcroftSurvivalRatesBreeding1979"/>
+    <w:bookmarkStart w:id="78" w:name="refs"/>
+    <w:bookmarkStart w:id="19" w:name="ref-ashcroftSurvivalRatesBreeding1979"/>
     <w:p>
       <w:pPr>
         <w:pStyle w:val="Bibliography"/>
@@ -1487,7 +1579,7 @@
       <w:r>
         <w:t xml:space="preserve"> </w:t>
       </w:r>
-      <w:hyperlink r:id="rId15">
+      <w:hyperlink r:id="rId18">
         <w:r>
           <w:rPr>
             <w:rStyle w:val="Hyperlink"/>
@@ -1496,8 +1588,8 @@
         </w:r>
       </w:hyperlink>
     </w:p>
-    <w:bookmarkEnd w:id="16"/>
-    <w:bookmarkStart w:id="18" w:name="ref-ausemsVariationFoodAvailability2026"/>
+    <w:bookmarkEnd w:id="19"/>
+    <w:bookmarkStart w:id="21" w:name="ref-ausemsVariationFoodAvailability2026"/>
     <w:p>
       <w:pPr>
         <w:pStyle w:val="Bibliography"/>
@@ -1572,7 +1664,7 @@
       <w:r>
         <w:t xml:space="preserve"> </w:t>
       </w:r>
-      <w:hyperlink r:id="rId17">
+      <w:hyperlink r:id="rId20">
         <w:r>
           <w:rPr>
             <w:rStyle w:val="Hyperlink"/>
@@ -1581,8 +1673,8 @@
         </w:r>
       </w:hyperlink>
     </w:p>
-    <w:bookmarkEnd w:id="18"/>
-    <w:bookmarkStart w:id="20" w:name="ref-baileyIncubationPatchPasserine1952"/>
+    <w:bookmarkEnd w:id="21"/>
+    <w:bookmarkStart w:id="23" w:name="ref-baileyIncubationPatchPasserine1952"/>
     <w:p>
       <w:pPr>
         <w:pStyle w:val="Bibliography"/>
@@ -1640,7 +1732,7 @@
       <w:r>
         <w:t xml:space="preserve"> </w:t>
       </w:r>
-      <w:hyperlink r:id="rId19">
+      <w:hyperlink r:id="rId22">
         <w:r>
           <w:rPr>
             <w:rStyle w:val="Hyperlink"/>
@@ -1649,8 +1741,8 @@
         </w:r>
       </w:hyperlink>
     </w:p>
-    <w:bookmarkEnd w:id="20"/>
-    <w:bookmarkStart w:id="22" w:name="X6fe9fda70bed21ba65d61585bcf1d825af477bf"/>
+    <w:bookmarkEnd w:id="23"/>
+    <w:bookmarkStart w:id="25" w:name="X6fe9fda70bed21ba65d61585bcf1d825af477bf"/>
     <w:p>
       <w:pPr>
         <w:pStyle w:val="Bibliography"/>
@@ -1718,7 +1810,7 @@
       <w:r>
         <w:t xml:space="preserve"> </w:t>
       </w:r>
-      <w:hyperlink r:id="rId21">
+      <w:hyperlink r:id="rId24">
         <w:r>
           <w:rPr>
             <w:rStyle w:val="Hyperlink"/>
@@ -1727,8 +1819,8 @@
         </w:r>
       </w:hyperlink>
     </w:p>
-    <w:bookmarkEnd w:id="22"/>
-    <w:bookmarkStart w:id="24" w:name="X2251d75557b56d22c3e2c47990efce73593f512"/>
+    <w:bookmarkEnd w:id="25"/>
+    <w:bookmarkStart w:id="27" w:name="X2251d75557b56d22c3e2c47990efce73593f512"/>
     <w:p>
       <w:pPr>
         <w:pStyle w:val="Bibliography"/>
@@ -1786,7 +1878,7 @@
       <w:r>
         <w:t xml:space="preserve"> </w:t>
       </w:r>
-      <w:hyperlink r:id="rId23">
+      <w:hyperlink r:id="rId26">
         <w:r>
           <w:rPr>
             <w:rStyle w:val="Hyperlink"/>
@@ -1795,8 +1887,8 @@
         </w:r>
       </w:hyperlink>
     </w:p>
-    <w:bookmarkEnd w:id="24"/>
-    <w:bookmarkStart w:id="26" w:name="ref-burknerBrmsPackageBayesian2017"/>
+    <w:bookmarkEnd w:id="27"/>
+    <w:bookmarkStart w:id="29" w:name="ref-burknerBrmsPackageBayesian2017"/>
     <w:p>
       <w:pPr>
         <w:pStyle w:val="Bibliography"/>
@@ -1875,7 +1967,7 @@
       <w:r>
         <w:t xml:space="preserve"> </w:t>
       </w:r>
-      <w:hyperlink r:id="rId25">
+      <w:hyperlink r:id="rId28">
         <w:r>
           <w:rPr>
             <w:rStyle w:val="Hyperlink"/>
@@ -1884,8 +1976,8 @@
         </w:r>
       </w:hyperlink>
     </w:p>
-    <w:bookmarkEnd w:id="26"/>
-    <w:bookmarkStart w:id="28" w:name="ref-burrLaterHigherLatitudes2016"/>
+    <w:bookmarkEnd w:id="29"/>
+    <w:bookmarkStart w:id="31" w:name="ref-burrLaterHigherLatitudes2016"/>
     <w:p>
       <w:pPr>
         <w:pStyle w:val="Bibliography"/>
@@ -1922,7 +2014,7 @@
       <w:r>
         <w:t xml:space="preserve"> </w:t>
       </w:r>
-      <w:hyperlink r:id="rId27">
+      <w:hyperlink r:id="rId30">
         <w:r>
           <w:rPr>
             <w:rStyle w:val="Hyperlink"/>
@@ -1931,8 +2023,8 @@
         </w:r>
       </w:hyperlink>
     </w:p>
-    <w:bookmarkEnd w:id="28"/>
-    <w:bookmarkStart w:id="30" w:name="ref-clairbauxNorthAtlanticWinter2021"/>
+    <w:bookmarkEnd w:id="31"/>
+    <w:bookmarkStart w:id="33" w:name="ref-clairbauxNorthAtlanticWinter2021"/>
     <w:p>
       <w:pPr>
         <w:pStyle w:val="Bibliography"/>
@@ -1981,7 +2073,7 @@
       <w:r>
         <w:t xml:space="preserve"> </w:t>
       </w:r>
-      <w:hyperlink r:id="rId29">
+      <w:hyperlink r:id="rId32">
         <w:r>
           <w:rPr>
             <w:rStyle w:val="Hyperlink"/>
@@ -1990,8 +2082,8 @@
         </w:r>
       </w:hyperlink>
     </w:p>
-    <w:bookmarkEnd w:id="30"/>
-    <w:bookmarkStart w:id="32" w:name="ref-diasThreatsSeabirdsGlobal2019"/>
+    <w:bookmarkEnd w:id="33"/>
+    <w:bookmarkStart w:id="35" w:name="ref-diasThreatsSeabirdsGlobal2019"/>
     <w:p>
       <w:pPr>
         <w:pStyle w:val="Bibliography"/>
@@ -2040,7 +2132,7 @@
       <w:r>
         <w:t xml:space="preserve"> </w:t>
       </w:r>
-      <w:hyperlink r:id="rId31">
+      <w:hyperlink r:id="rId34">
         <w:r>
           <w:rPr>
             <w:rStyle w:val="Hyperlink"/>
@@ -2049,8 +2141,8 @@
         </w:r>
       </w:hyperlink>
     </w:p>
-    <w:bookmarkEnd w:id="32"/>
-    <w:bookmarkStart w:id="34" w:name="ref-dohertyTestingLifeHistory2004"/>
+    <w:bookmarkEnd w:id="35"/>
+    <w:bookmarkStart w:id="37" w:name="ref-dohertyTestingLifeHistory2004"/>
     <w:p>
       <w:pPr>
         <w:pStyle w:val="Bibliography"/>
@@ -2087,7 +2179,7 @@
       <w:r>
         <w:t xml:space="preserve"> </w:t>
       </w:r>
-      <w:hyperlink r:id="rId33">
+      <w:hyperlink r:id="rId36">
         <w:r>
           <w:rPr>
             <w:rStyle w:val="Hyperlink"/>
@@ -2096,8 +2188,8 @@
         </w:r>
       </w:hyperlink>
     </w:p>
-    <w:bookmarkEnd w:id="34"/>
-    <w:bookmarkStart w:id="36" w:name="ref-durantRegimeShiftsBreeding2004"/>
+    <w:bookmarkEnd w:id="37"/>
+    <w:bookmarkStart w:id="39" w:name="ref-durantRegimeShiftsBreeding2004"/>
     <w:p>
       <w:pPr>
         <w:pStyle w:val="Bibliography"/>
@@ -2146,7 +2238,7 @@
       <w:r>
         <w:t xml:space="preserve"> </w:t>
       </w:r>
-      <w:hyperlink r:id="rId35">
+      <w:hyperlink r:id="rId38">
         <w:r>
           <w:rPr>
             <w:rStyle w:val="Hyperlink"/>
@@ -2155,8 +2247,8 @@
         </w:r>
       </w:hyperlink>
     </w:p>
-    <w:bookmarkEnd w:id="36"/>
-    <w:bookmarkStart w:id="37" w:name="ref-fayetLocalPreyShortages2021"/>
+    <w:bookmarkEnd w:id="39"/>
+    <w:bookmarkStart w:id="40" w:name="ref-fayetLocalPreyShortages2021"/>
     <w:p>
       <w:pPr>
         <w:pStyle w:val="Bibliography"/>
@@ -2203,8 +2295,8 @@
         <w:t xml:space="preserve">, 1152–1164.</w:t>
       </w:r>
     </w:p>
-    <w:bookmarkEnd w:id="37"/>
-    <w:bookmarkStart w:id="39" w:name="X402cb5e1a4e69ff49497d0188bad825f79b15d6"/>
+    <w:bookmarkEnd w:id="40"/>
+    <w:bookmarkStart w:id="42" w:name="X402cb5e1a4e69ff49497d0188bad825f79b15d6"/>
     <w:p>
       <w:pPr>
         <w:pStyle w:val="Bibliography"/>
@@ -2250,7 +2342,7 @@
       <w:r>
         <w:t xml:space="preserve"> </w:t>
       </w:r>
-      <w:hyperlink r:id="rId38">
+      <w:hyperlink r:id="rId41">
         <w:r>
           <w:rPr>
             <w:rStyle w:val="Hyperlink"/>
@@ -2259,8 +2351,8 @@
         </w:r>
       </w:hyperlink>
     </w:p>
-    <w:bookmarkEnd w:id="39"/>
-    <w:bookmarkStart w:id="41" w:name="X33c5e51ec6e1feb638e31c81b30fec3bad61a46"/>
+    <w:bookmarkEnd w:id="42"/>
+    <w:bookmarkStart w:id="44" w:name="X33c5e51ec6e1feb638e31c81b30fec3bad61a46"/>
     <w:p>
       <w:pPr>
         <w:pStyle w:val="Bibliography"/>
@@ -2297,7 +2389,7 @@
       <w:r>
         <w:t xml:space="preserve"> </w:t>
       </w:r>
-      <w:hyperlink r:id="rId40">
+      <w:hyperlink r:id="rId43">
         <w:r>
           <w:rPr>
             <w:rStyle w:val="Hyperlink"/>
@@ -2306,8 +2398,8 @@
         </w:r>
       </w:hyperlink>
     </w:p>
-    <w:bookmarkEnd w:id="41"/>
-    <w:bookmarkStart w:id="42" w:name="Xd2c1001e50c6a03f5980b48bf021065e127b4b3"/>
+    <w:bookmarkEnd w:id="44"/>
+    <w:bookmarkStart w:id="45" w:name="Xd2c1001e50c6a03f5980b48bf021065e127b4b3"/>
     <w:p>
       <w:pPr>
         <w:pStyle w:val="Bibliography"/>
@@ -2388,8 +2480,8 @@
         <w:t xml:space="preserve">(p. 177). Fróðskapur, Faroe University Press.</w:t>
       </w:r>
     </w:p>
-    <w:bookmarkEnd w:id="42"/>
-    <w:bookmarkStart w:id="44" w:name="X686eab3f81361263a84b2098b98864d463c743b"/>
+    <w:bookmarkEnd w:id="45"/>
+    <w:bookmarkStart w:id="47" w:name="X686eab3f81361263a84b2098b98864d463c743b"/>
     <w:p>
       <w:pPr>
         <w:pStyle w:val="Bibliography"/>
@@ -2426,7 +2518,7 @@
       <w:r>
         <w:t xml:space="preserve"> </w:t>
       </w:r>
-      <w:hyperlink r:id="rId43">
+      <w:hyperlink r:id="rId46">
         <w:r>
           <w:rPr>
             <w:rStyle w:val="Hyperlink"/>
@@ -2435,8 +2527,8 @@
         </w:r>
       </w:hyperlink>
     </w:p>
-    <w:bookmarkEnd w:id="44"/>
-    <w:bookmarkStart w:id="45" w:name="ref-jensenPuffinFowlingaFowling2010"/>
+    <w:bookmarkEnd w:id="47"/>
+    <w:bookmarkStart w:id="48" w:name="ref-jensenPuffinFowlingaFowling2010"/>
     <w:p>
       <w:pPr>
         <w:pStyle w:val="Bibliography"/>
@@ -2493,8 +2585,8 @@
         <w:t xml:space="preserve">. Føroya Skúlabókagrunnur.</w:t>
       </w:r>
     </w:p>
-    <w:bookmarkEnd w:id="45"/>
-    <w:bookmarkStart w:id="46" w:name="ref-jensenListBirdsSeen2005"/>
+    <w:bookmarkEnd w:id="48"/>
+    <w:bookmarkStart w:id="49" w:name="ref-jensenListBirdsSeen2005"/>
     <w:p>
       <w:pPr>
         <w:pStyle w:val="Bibliography"/>
@@ -2553,8 +2645,8 @@
         <w:t xml:space="preserve">. Føroya Náttúrugripasavn, Tórshavn, Faroe Islands.</w:t>
       </w:r>
     </w:p>
-    <w:bookmarkEnd w:id="46"/>
-    <w:bookmarkStart w:id="47" w:name="ref-jensenTraditionsPuffinFowling2020"/>
+    <w:bookmarkEnd w:id="49"/>
+    <w:bookmarkStart w:id="50" w:name="ref-jensenTraditionsPuffinFowling2020"/>
     <w:p>
       <w:pPr>
         <w:pStyle w:val="Bibliography"/>
@@ -2601,8 +2693,8 @@
         <w:t xml:space="preserve">, 3–17.</w:t>
       </w:r>
     </w:p>
-    <w:bookmarkEnd w:id="47"/>
-    <w:bookmarkStart w:id="49" w:name="X289cc0e6e2d6f2de639c6553ec3bb635a7ae663"/>
+    <w:bookmarkEnd w:id="50"/>
+    <w:bookmarkStart w:id="52" w:name="X289cc0e6e2d6f2de639c6553ec3bb635a7ae663"/>
     <w:p>
       <w:pPr>
         <w:pStyle w:val="Bibliography"/>
@@ -2651,7 +2743,7 @@
       <w:r>
         <w:t xml:space="preserve"> </w:t>
       </w:r>
-      <w:hyperlink r:id="rId48">
+      <w:hyperlink r:id="rId51">
         <w:r>
           <w:rPr>
             <w:rStyle w:val="Hyperlink"/>
@@ -2660,8 +2752,8 @@
         </w:r>
       </w:hyperlink>
     </w:p>
-    <w:bookmarkEnd w:id="49"/>
-    <w:bookmarkStart w:id="51" w:name="ref-johnson2024icelandic"/>
+    <w:bookmarkEnd w:id="52"/>
+    <w:bookmarkStart w:id="54" w:name="ref-johnson2024icelandic"/>
     <w:p>
       <w:pPr>
         <w:pStyle w:val="Bibliography"/>
@@ -2685,7 +2777,7 @@
       <w:r>
         <w:t xml:space="preserve"> </w:t>
       </w:r>
-      <w:hyperlink r:id="rId50">
+      <w:hyperlink r:id="rId53">
         <w:r>
           <w:rPr>
             <w:rStyle w:val="Hyperlink"/>
@@ -2694,8 +2786,8 @@
         </w:r>
       </w:hyperlink>
     </w:p>
-    <w:bookmarkEnd w:id="51"/>
-    <w:bookmarkStart w:id="53" w:name="ref-jonesIncubationPatchBirds1971"/>
+    <w:bookmarkEnd w:id="54"/>
+    <w:bookmarkStart w:id="56" w:name="ref-jonesIncubationPatchBirds1971"/>
     <w:p>
       <w:pPr>
         <w:pStyle w:val="Bibliography"/>
@@ -2753,7 +2845,7 @@
       <w:r>
         <w:t xml:space="preserve"> </w:t>
       </w:r>
-      <w:hyperlink r:id="rId52">
+      <w:hyperlink r:id="rId55">
         <w:r>
           <w:rPr>
             <w:rStyle w:val="Hyperlink"/>
@@ -2762,8 +2854,8 @@
         </w:r>
       </w:hyperlink>
     </w:p>
-    <w:bookmarkEnd w:id="53"/>
-    <w:bookmarkStart w:id="54" w:name="Xe19625febeb906ccdb6e58cd53cb47af33dcf28"/>
+    <w:bookmarkEnd w:id="56"/>
+    <w:bookmarkStart w:id="57" w:name="Xe19625febeb906ccdb6e58cd53cb47af33dcf28"/>
     <w:p>
       <w:pPr>
         <w:pStyle w:val="Bibliography"/>
@@ -2772,8 +2864,8 @@
         <w:t xml:space="preserve">Løgtingslóg Um Fuglaveiðu, Sum Seinast Broytt Við Løgtingslóg Nr. 70 Frá 22. Mai 2023 (1984).</w:t>
       </w:r>
     </w:p>
-    <w:bookmarkEnd w:id="54"/>
-    <w:bookmarkStart w:id="56" w:name="ref-lowtherAtlanticPuffinFratercula2020"/>
+    <w:bookmarkEnd w:id="57"/>
+    <w:bookmarkStart w:id="59" w:name="ref-lowtherAtlanticPuffinFratercula2020"/>
     <w:p>
       <w:pPr>
         <w:pStyle w:val="Bibliography"/>
@@ -2806,7 +2898,7 @@
       <w:r>
         <w:t xml:space="preserve"> </w:t>
       </w:r>
-      <w:hyperlink r:id="rId55">
+      <w:hyperlink r:id="rId58">
         <w:r>
           <w:rPr>
             <w:rStyle w:val="Hyperlink"/>
@@ -2815,8 +2907,8 @@
         </w:r>
       </w:hyperlink>
     </w:p>
-    <w:bookmarkEnd w:id="56"/>
-    <w:bookmarkStart w:id="58" w:name="X207bec76f29f8d8311150c8279e9cc679159524"/>
+    <w:bookmarkEnd w:id="59"/>
+    <w:bookmarkStart w:id="61" w:name="X207bec76f29f8d8311150c8279e9cc679159524"/>
     <w:p>
       <w:pPr>
         <w:pStyle w:val="Bibliography"/>
@@ -2916,7 +3008,7 @@
       <w:r>
         <w:t xml:space="preserve"> </w:t>
       </w:r>
-      <w:hyperlink r:id="rId57">
+      <w:hyperlink r:id="rId60">
         <w:r>
           <w:rPr>
             <w:rStyle w:val="Hyperlink"/>
@@ -2925,8 +3017,8 @@
         </w:r>
       </w:hyperlink>
     </w:p>
-    <w:bookmarkEnd w:id="58"/>
-    <w:bookmarkStart w:id="60" w:name="X958f21470482a6a06ce614515743210bd9f3c46"/>
+    <w:bookmarkEnd w:id="61"/>
+    <w:bookmarkStart w:id="63" w:name="X958f21470482a6a06ce614515743210bd9f3c46"/>
     <w:p>
       <w:pPr>
         <w:pStyle w:val="Bibliography"/>
@@ -3029,7 +3121,7 @@
       <w:r>
         <w:t xml:space="preserve"> </w:t>
       </w:r>
-      <w:hyperlink r:id="rId59">
+      <w:hyperlink r:id="rId62">
         <w:r>
           <w:rPr>
             <w:rStyle w:val="Hyperlink"/>
@@ -3038,8 +3130,8 @@
         </w:r>
       </w:hyperlink>
     </w:p>
-    <w:bookmarkEnd w:id="60"/>
-    <w:bookmarkStart w:id="62" w:name="ref-milesDeclineAtlanticPuffin2015"/>
+    <w:bookmarkEnd w:id="63"/>
+    <w:bookmarkStart w:id="65" w:name="ref-milesDeclineAtlanticPuffin2015"/>
     <w:p>
       <w:pPr>
         <w:pStyle w:val="Bibliography"/>
@@ -3118,7 +3210,7 @@
       <w:r>
         <w:t xml:space="preserve"> </w:t>
       </w:r>
-      <w:hyperlink r:id="rId61">
+      <w:hyperlink r:id="rId64">
         <w:r>
           <w:rPr>
             <w:rStyle w:val="Hyperlink"/>
@@ -3127,8 +3219,8 @@
         </w:r>
       </w:hyperlink>
     </w:p>
-    <w:bookmarkEnd w:id="62"/>
-    <w:bookmarkStart w:id="64" w:name="ref-rcoreteamRLanguageEnvironment2026"/>
+    <w:bookmarkEnd w:id="65"/>
+    <w:bookmarkStart w:id="67" w:name="ref-rcoreteamRLanguageEnvironment2026"/>
     <w:p>
       <w:pPr>
         <w:pStyle w:val="Bibliography"/>
@@ -3222,7 +3314,7 @@
       <w:r>
         <w:t xml:space="preserve"> </w:t>
       </w:r>
-      <w:hyperlink r:id="rId63">
+      <w:hyperlink r:id="rId66">
         <w:r>
           <w:rPr>
             <w:rStyle w:val="Hyperlink"/>
@@ -3231,8 +3323,8 @@
         </w:r>
       </w:hyperlink>
     </w:p>
-    <w:bookmarkEnd w:id="64"/>
-    <w:bookmarkStart w:id="65" w:name="ref-sandvikHighSurvivalImmatures2008"/>
+    <w:bookmarkEnd w:id="67"/>
+    <w:bookmarkStart w:id="68" w:name="ref-sandvikHighSurvivalImmatures2008"/>
     <w:p>
       <w:pPr>
         <w:pStyle w:val="Bibliography"/>
@@ -3288,13 +3380,60 @@
         <w:t xml:space="preserve">, 723–730.</w:t>
       </w:r>
     </w:p>
-    <w:bookmarkEnd w:id="65"/>
-    <w:bookmarkStart w:id="67" w:name="ref-vanfraneker2004"/>
+    <w:bookmarkEnd w:id="68"/>
+    <w:bookmarkStart w:id="70" w:name="X3ede5c96a343fbec70bed9a420846eae3dca84b"/>
     <w:p>
       <w:pPr>
         <w:pStyle w:val="Bibliography"/>
       </w:pPr>
       <w:r>
+        <w:t xml:space="preserve">Taylor, L. U., &amp; Gnam, E. (2026). Prebreeding populations and the importance of life history for conserving imperiled seabirds.</w:t>
+      </w:r>
+      <w:r>
+        <w:t xml:space="preserve"> </w:t>
+      </w:r>
+      <w:r>
+        <w:rPr>
+          <w:i/>
+          <w:iCs/>
+        </w:rPr>
+        <w:t xml:space="preserve">Frontiers in Ecology and the Environment</w:t>
+      </w:r>
+      <w:r>
+        <w:t xml:space="preserve">,</w:t>
+      </w:r>
+      <w:r>
+        <w:t xml:space="preserve"> </w:t>
+      </w:r>
+      <w:r>
+        <w:rPr>
+          <w:i/>
+          <w:iCs/>
+        </w:rPr>
+        <w:t xml:space="preserve">24</w:t>
+      </w:r>
+      <w:r>
+        <w:t xml:space="preserve">(6), e70049.</w:t>
+      </w:r>
+      <w:r>
+        <w:t xml:space="preserve"> </w:t>
+      </w:r>
+      <w:hyperlink r:id="rId69">
+        <w:r>
+          <w:rPr>
+            <w:rStyle w:val="Hyperlink"/>
+          </w:rPr>
+          <w:t xml:space="preserve">https://doi.org/10.1002/fee.70049</w:t>
+        </w:r>
+      </w:hyperlink>
+    </w:p>
+    <w:bookmarkEnd w:id="70"/>
+    <w:bookmarkStart w:id="72" w:name="ref-vanfraneker2004"/>
+    <w:p>
+      <w:pPr>
+        <w:pStyle w:val="Bibliography"/>
+      </w:pPr>
+      <w:r>
         <w:t xml:space="preserve">Van Franeker, J. A. (2004).</w:t>
       </w:r>
       <w:r>
@@ -3344,7 +3483,7 @@
       <w:r>
         <w:t xml:space="preserve"> </w:t>
       </w:r>
-      <w:hyperlink r:id="rId66">
+      <w:hyperlink r:id="rId71">
         <w:r>
           <w:rPr>
             <w:rStyle w:val="Hyperlink"/>
@@ -3353,8 +3492,8 @@
         </w:r>
       </w:hyperlink>
     </w:p>
-    <w:bookmarkEnd w:id="67"/>
-    <w:bookmarkStart w:id="69" w:name="ref-vehtariPracticalBayesianModel2017"/>
+    <w:bookmarkEnd w:id="72"/>
+    <w:bookmarkStart w:id="74" w:name="ref-vehtariPracticalBayesianModel2017"/>
     <w:p>
       <w:pPr>
         <w:pStyle w:val="Bibliography"/>
@@ -3412,7 +3551,7 @@
       <w:r>
         <w:t xml:space="preserve"> </w:t>
       </w:r>
-      <w:hyperlink r:id="rId68">
+      <w:hyperlink r:id="rId73">
         <w:r>
           <w:rPr>
             <w:rStyle w:val="Hyperlink"/>
@@ -3421,8 +3560,8 @@
         </w:r>
       </w:hyperlink>
     </w:p>
-    <w:bookmarkEnd w:id="69"/>
-    <w:bookmarkStart w:id="71" w:name="Xb381b5d8d6d3401bbb0133a1c086c6f6782b533"/>
+    <w:bookmarkEnd w:id="74"/>
+    <w:bookmarkStart w:id="76" w:name="Xb381b5d8d6d3401bbb0133a1c086c6f6782b533"/>
     <w:p>
       <w:pPr>
         <w:pStyle w:val="Bibliography"/>
@@ -3528,7 +3667,7 @@
       <w:r>
         <w:t xml:space="preserve"> </w:t>
       </w:r>
-      <w:hyperlink r:id="rId70">
+      <w:hyperlink r:id="rId75">
         <w:r>
           <w:rPr>
             <w:rStyle w:val="Hyperlink"/>
@@ -3537,8 +3676,8 @@
         </w:r>
       </w:hyperlink>
     </w:p>
-    <w:bookmarkEnd w:id="71"/>
-    <w:bookmarkStart w:id="72" w:name="ref-vehtariParetoSmoothedImportance2024"/>
+    <w:bookmarkEnd w:id="76"/>
+    <w:bookmarkStart w:id="77" w:name="ref-vehtariParetoSmoothedImportance2024"/>
     <w:p>
       <w:pPr>
         <w:pStyle w:val="Bibliography"/>
@@ -3573,8 +3712,8 @@
         <w:t xml:space="preserve">(72), 1–58.</w:t>
       </w:r>
     </w:p>
-    <w:bookmarkEnd w:id="72"/>
-    <w:bookmarkEnd w:id="73"/>
+    <w:bookmarkEnd w:id="77"/>
+    <w:bookmarkEnd w:id="78"/>
     <w:p>
       <w:r>
         <w:br w:type="page"/>
@@ -3660,117 +3799,24 @@
       <w:tr>
         <w:tc>
           <w:tcPr/>
-          <w:bookmarkStart w:id="78" w:name="fig-map"/>
+          <w:bookmarkStart w:id="83" w:name="fig-map"/>
           <w:p>
             <w:pPr>
               <w:pStyle w:val="Compact"/>
               <w:jc w:val="center"/>
             </w:pPr>
-            <w:bookmarkStart w:id="77" w:name="fig-map"/>
+            <w:bookmarkStart w:id="82" w:name="fig-map"/>
             <w:r>
               <w:drawing>
                 <wp:inline>
                   <wp:extent cx="5943600" cy="6028508"/>
-                  <wp:effectExtent b="0" l="0" r="0" t="0"/>
-                  <wp:docPr descr="" title="" id="75" name="Picture"/>
-                  <a:graphic>
-                    <a:graphicData uri="http://schemas.openxmlformats.org/drawingml/2006/picture">
-                      <pic:pic>
-                        <pic:nvPicPr>
-                          <pic:cNvPr descr="manuscript_files/figure-docx/fig-map-1.png" id="76" name="Picture"/>
-                          <pic:cNvPicPr>
-                            <a:picLocks noChangeArrowheads="1" noChangeAspect="1"/>
-                          </pic:cNvPicPr>
-                        </pic:nvPicPr>
-                        <pic:blipFill>
-                          <a:blip r:embed="rId74"/>
-                          <a:stretch>
-                            <a:fillRect/>
-                          </a:stretch>
-                        </pic:blipFill>
-                        <pic:spPr bwMode="auto">
-                          <a:xfrm>
-                            <a:off x="0" y="0"/>
-                            <a:ext cx="5943600" cy="6028508"/>
-                          </a:xfrm>
-                          <a:prstGeom prst="rect">
-                            <a:avLst/>
-                          </a:prstGeom>
-                          <a:noFill/>
-                          <a:ln w="9525">
-                            <a:noFill/>
-                            <a:headEnd/>
-                            <a:tailEnd/>
-                          </a:ln>
-                        </pic:spPr>
-                      </pic:pic>
-                    </a:graphicData>
-                  </a:graphic>
-                </wp:inline>
-              </w:drawing>
-            </w:r>
-            <w:bookmarkEnd w:id="77"/>
-          </w:p>
-          <w:p>
-            <w:pPr>
-              <w:jc w:val="center"/>
-            </w:pPr>
-            <w:pPr>
-              <w:jc w:val="left"/>
-              <w:spacing w:before="200"/>
-              <w:pStyle w:val="ImageCaption"/>
-            </w:pPr>
-            <w:r>
-              <w:rPr>
-                <w:b/>
-                <w:bCs/>
-              </w:rPr>
-              <w:t xml:space="preserve">Fig.</w:t>
-            </w:r>
-            <w:r>
-              <w:t xml:space="preserve"> 1</w:t>
-            </w:r>
-          </w:p>
-          <w:bookmarkEnd w:id="78"/>
-        </w:tc>
-      </w:tr>
-    </w:tbl>
-    <w:p>
-      <w:r>
-        <w:br w:type="page"/>
-      </w:r>
-    </w:p>
-    <w:tbl>
-      <w:tblPr>
-        <w:tblStyle w:val="Table"/>
-        <w:tblW w:type="pct" w:w="5000"/>
-        <w:tblLayout w:type="fixed"/>
-        <w:tblLook w:firstRow="0" w:lastRow="0" w:firstColumn="0" w:lastColumn="0" w:noHBand="0" w:noVBand="0" w:val="0000"/>
-      </w:tblPr>
-      <w:tblGrid>
-        <w:gridCol w:w="7920"/>
-      </w:tblGrid>
-      <w:tr>
-        <w:tc>
-          <w:tcPr/>
-          <w:bookmarkStart w:id="83" w:name="fig-marg-bar"/>
-          <w:p>
-            <w:pPr>
-              <w:pStyle w:val="Compact"/>
-              <w:jc w:val="center"/>
-            </w:pPr>
-            <w:bookmarkStart w:id="82" w:name="fig-marg-bar"/>
-            <w:r>
-              <w:drawing>
-                <wp:inline>
-                  <wp:extent cx="5943600" cy="4245428"/>
                   <wp:effectExtent b="0" l="0" r="0" t="0"/>
                   <wp:docPr descr="" title="" id="80" name="Picture"/>
                   <a:graphic>
                     <a:graphicData uri="http://schemas.openxmlformats.org/drawingml/2006/picture">
                       <pic:pic>
                         <pic:nvPicPr>
-                          <pic:cNvPr descr="manuscript_files/figure-docx/fig-marg-bar-1.png" id="81" name="Picture"/>
+                          <pic:cNvPr descr="manuscript_files/figure-docx/fig-map-1.png" id="81" name="Picture"/>
                           <pic:cNvPicPr>
                             <a:picLocks noChangeArrowheads="1" noChangeAspect="1"/>
                           </pic:cNvPicPr>
@@ -3784,7 +3830,7 @@
                         <pic:spPr bwMode="auto">
                           <a:xfrm>
                             <a:off x="0" y="0"/>
-                            <a:ext cx="5943600" cy="4245428"/>
+                            <a:ext cx="5943600" cy="6028508"/>
                           </a:xfrm>
                           <a:prstGeom prst="rect">
                             <a:avLst/>
@@ -3821,7 +3867,7 @@
               <w:t xml:space="preserve">Fig.</w:t>
             </w:r>
             <w:r>
-              <w:t xml:space="preserve"> 2</w:t>
+              <w:t xml:space="preserve"> 1</w:t>
             </w:r>
           </w:p>
           <w:bookmarkEnd w:id="83"/>
@@ -3846,13 +3892,13 @@
       <w:tr>
         <w:tc>
           <w:tcPr/>
-          <w:bookmarkStart w:id="88" w:name="fig-pred1"/>
+          <w:bookmarkStart w:id="88" w:name="fig-marg-bar"/>
           <w:p>
             <w:pPr>
               <w:pStyle w:val="Compact"/>
               <w:jc w:val="center"/>
             </w:pPr>
-            <w:bookmarkStart w:id="87" w:name="fig-pred1"/>
+            <w:bookmarkStart w:id="87" w:name="fig-marg-bar"/>
             <w:r>
               <w:drawing>
                 <wp:inline>
@@ -3863,7 +3909,7 @@
                     <a:graphicData uri="http://schemas.openxmlformats.org/drawingml/2006/picture">
                       <pic:pic>
                         <pic:nvPicPr>
-                          <pic:cNvPr descr="manuscript_files/figure-docx/fig-pred1-1.png" id="86" name="Picture"/>
+                          <pic:cNvPr descr="manuscript_files/figure-docx/fig-marg-bar-1.png" id="86" name="Picture"/>
                           <pic:cNvPicPr>
                             <a:picLocks noChangeArrowheads="1" noChangeAspect="1"/>
                           </pic:cNvPicPr>
@@ -3914,7 +3960,7 @@
               <w:t xml:space="preserve">Fig.</w:t>
             </w:r>
             <w:r>
-              <w:t xml:space="preserve"> 3</w:t>
+              <w:t xml:space="preserve"> 2</w:t>
             </w:r>
           </w:p>
           <w:bookmarkEnd w:id="88"/>
@@ -3939,13 +3985,13 @@
       <w:tr>
         <w:tc>
           <w:tcPr/>
-          <w:bookmarkStart w:id="93" w:name="fig-pred2"/>
+          <w:bookmarkStart w:id="93" w:name="fig-pred1"/>
           <w:p>
             <w:pPr>
               <w:pStyle w:val="Compact"/>
               <w:jc w:val="center"/>
             </w:pPr>
-            <w:bookmarkStart w:id="92" w:name="fig-pred2"/>
+            <w:bookmarkStart w:id="92" w:name="fig-pred1"/>
             <w:r>
               <w:drawing>
                 <wp:inline>
@@ -3956,7 +4002,7 @@
                     <a:graphicData uri="http://schemas.openxmlformats.org/drawingml/2006/picture">
                       <pic:pic>
                         <pic:nvPicPr>
-                          <pic:cNvPr descr="manuscript_files/figure-docx/fig-pred2-1.png" id="91" name="Picture"/>
+                          <pic:cNvPr descr="manuscript_files/figure-docx/fig-pred1-1.png" id="91" name="Picture"/>
                           <pic:cNvPicPr>
                             <a:picLocks noChangeArrowheads="1" noChangeAspect="1"/>
                           </pic:cNvPicPr>
@@ -4007,7 +4053,7 @@
               <w:t xml:space="preserve">Fig.</w:t>
             </w:r>
             <w:r>
-              <w:t xml:space="preserve"> 4</w:t>
+              <w:t xml:space="preserve"> 3</w:t>
             </w:r>
           </w:p>
           <w:bookmarkEnd w:id="93"/>
@@ -4032,7 +4078,100 @@
       <w:tr>
         <w:tc>
           <w:tcPr/>
-          <w:bookmarkStart w:id="94" w:name="tbl-harvest"/>
+          <w:bookmarkStart w:id="98" w:name="fig-pred2"/>
+          <w:p>
+            <w:pPr>
+              <w:pStyle w:val="Compact"/>
+              <w:jc w:val="center"/>
+            </w:pPr>
+            <w:bookmarkStart w:id="97" w:name="fig-pred2"/>
+            <w:r>
+              <w:drawing>
+                <wp:inline>
+                  <wp:extent cx="5943600" cy="4245428"/>
+                  <wp:effectExtent b="0" l="0" r="0" t="0"/>
+                  <wp:docPr descr="" title="" id="95" name="Picture"/>
+                  <a:graphic>
+                    <a:graphicData uri="http://schemas.openxmlformats.org/drawingml/2006/picture">
+                      <pic:pic>
+                        <pic:nvPicPr>
+                          <pic:cNvPr descr="manuscript_files/figure-docx/fig-pred2-1.png" id="96" name="Picture"/>
+                          <pic:cNvPicPr>
+                            <a:picLocks noChangeArrowheads="1" noChangeAspect="1"/>
+                          </pic:cNvPicPr>
+                        </pic:nvPicPr>
+                        <pic:blipFill>
+                          <a:blip r:embed="rId94"/>
+                          <a:stretch>
+                            <a:fillRect/>
+                          </a:stretch>
+                        </pic:blipFill>
+                        <pic:spPr bwMode="auto">
+                          <a:xfrm>
+                            <a:off x="0" y="0"/>
+                            <a:ext cx="5943600" cy="4245428"/>
+                          </a:xfrm>
+                          <a:prstGeom prst="rect">
+                            <a:avLst/>
+                          </a:prstGeom>
+                          <a:noFill/>
+                          <a:ln w="9525">
+                            <a:noFill/>
+                            <a:headEnd/>
+                            <a:tailEnd/>
+                          </a:ln>
+                        </pic:spPr>
+                      </pic:pic>
+                    </a:graphicData>
+                  </a:graphic>
+                </wp:inline>
+              </w:drawing>
+            </w:r>
+            <w:bookmarkEnd w:id="97"/>
+          </w:p>
+          <w:p>
+            <w:pPr>
+              <w:jc w:val="center"/>
+            </w:pPr>
+            <w:pPr>
+              <w:jc w:val="left"/>
+              <w:spacing w:before="200"/>
+              <w:pStyle w:val="ImageCaption"/>
+            </w:pPr>
+            <w:r>
+              <w:rPr>
+                <w:b/>
+                <w:bCs/>
+              </w:rPr>
+              <w:t xml:space="preserve">Fig.</w:t>
+            </w:r>
+            <w:r>
+              <w:t xml:space="preserve"> 4</w:t>
+            </w:r>
+          </w:p>
+          <w:bookmarkEnd w:id="98"/>
+        </w:tc>
+      </w:tr>
+    </w:tbl>
+    <w:p>
+      <w:r>
+        <w:br w:type="page"/>
+      </w:r>
+    </w:p>
+    <w:tbl>
+      <w:tblPr>
+        <w:tblStyle w:val="Table"/>
+        <w:tblW w:type="pct" w:w="5000"/>
+        <w:tblLayout w:type="fixed"/>
+        <w:tblLook w:firstRow="0" w:lastRow="0" w:firstColumn="0" w:lastColumn="0" w:noHBand="0" w:noVBand="0" w:val="0000"/>
+      </w:tblPr>
+      <w:tblGrid>
+        <w:gridCol w:w="7920"/>
+      </w:tblGrid>
+      <w:tr>
+        <w:tc>
+          <w:tcPr/>
+          <w:bookmarkStart w:id="99" w:name="tbl-harvest"/>
           <w:p>
             <w:pPr>
               <w:jc w:val="center"/>
@@ -5470,7 +5609,7 @@
               </w:tc>
             </w:tr>
           </w:tbl>
-          <w:bookmarkEnd w:id="94"/>
+          <w:bookmarkEnd w:id="99"/>
           <w:p/>
         </w:tc>
       </w:tr>
@@ -5493,7 +5632,7 @@
       <w:tr>
         <w:tc>
           <w:tcPr/>
-          <w:bookmarkStart w:id="95" w:name="tbl-odds1"/>
+          <w:bookmarkStart w:id="100" w:name="tbl-odds1"/>
           <w:p>
             <w:pPr>
               <w:jc w:val="center"/>
@@ -5798,12 +5937,12 @@
               </w:tc>
             </w:tr>
           </w:tbl>
-          <w:bookmarkEnd w:id="95"/>
+          <w:bookmarkEnd w:id="100"/>
           <w:p/>
         </w:tc>
       </w:tr>
     </w:tbl>
-    <w:bookmarkEnd w:id="96"/>
+    <w:bookmarkEnd w:id="101"/>
     <w:sectPr>
       <w:type w:val="continuous"/>
       <w:pgSz w:h="15840" w:w="12240"/>

</xml_diff>

<commit_message>
added citation for doi
</commit_message>
<xml_diff>
--- a/manuscript/manuscript.docx
+++ b/manuscript/manuscript.docx
@@ -786,7 +786,17 @@
         <w:t xml:space="preserve"> </w:t>
       </w:r>
       <w:r>
-        <w:t xml:space="preserve">R Core Team (2026)</w:t>
+        <w:t xml:space="preserve">(</w:t>
+      </w:r>
+      <w:r>
+        <w:rPr>
+          <w:b/>
+          <w:bCs/>
+        </w:rPr>
+        <w:t xml:space="preserve">rcoreteamRLanguageEnvironment2026?</w:t>
+      </w:r>
+      <w:r>
+        <w:t xml:space="preserve">)</w:t>
       </w:r>
       <w:r>
         <w:t xml:space="preserve">] with breeding status (0 = never bred; 1 = has bred) as response variable. We included study year and brood patch presence (0 = absent; 1 = present) with an interaction as covariates. We used weakly informative priors: a normal (0, 1.5) prior on the brood patch presence and year × brood patch presence interaction, a more skeptical normal (0, 1) prior on the year trend, and the default Student-t (3, 0, 2.5) prior on the intercept. We centered year around the mean, and scaled it in decades, so the year prior constrains the plausible per-decade change in breeding probability. We confirmed that these priors implied plausible values using prior predictive checks [</w:t>
@@ -1480,6 +1490,12 @@
         </w:r>
       </w:hyperlink>
       <w:r>
+        <w:t xml:space="preserve"> </w:t>
+      </w:r>
+      <w:r>
+        <w:t xml:space="preserve">(Ausems &amp; Jensen, 2026)</w:t>
+      </w:r>
+      <w:r>
         <w:t xml:space="preserve">.</w:t>
       </w:r>
     </w:p>
@@ -1680,12 +1696,119 @@
       </w:hyperlink>
     </w:p>
     <w:bookmarkEnd w:id="22"/>
-    <w:bookmarkStart w:id="24" w:name="ref-baileyIncubationPatchPasserine1952"/>
+    <w:bookmarkStart w:id="24" w:name="X5001aa68545cec2af7068c5799e4bc0a6cad2bc"/>
     <w:p>
       <w:pPr>
         <w:pStyle w:val="Bibliography"/>
       </w:pPr>
       <w:r>
+        <w:t xml:space="preserve">Ausems, A. N. M. A., &amp; Jensen, J.-K. (2026).</w:t>
+      </w:r>
+      <w:r>
+        <w:t xml:space="preserve"> </w:t>
+      </w:r>
+      <w:r>
+        <w:rPr>
+          <w:i/>
+          <w:iCs/>
+        </w:rPr>
+        <w:t xml:space="preserve">Puffin_female_harvest: Code and data for ’</w:t>
+      </w:r>
+      <w:r>
+        <w:rPr>
+          <w:i/>
+          <w:iCs/>
+        </w:rPr>
+        <w:t xml:space="preserve">Pre-breeding Atlantic</w:t>
+      </w:r>
+      <w:r>
+        <w:rPr>
+          <w:i/>
+          <w:iCs/>
+        </w:rPr>
+        <w:t xml:space="preserve"> </w:t>
+      </w:r>
+      <w:r>
+        <w:rPr>
+          <w:i/>
+          <w:iCs/>
+        </w:rPr>
+        <w:t xml:space="preserve">puffins (</w:t>
+      </w:r>
+      <w:r>
+        <w:rPr>
+          <w:i/>
+          <w:iCs/>
+        </w:rPr>
+        <w:t xml:space="preserve">Fratercula</w:t>
+      </w:r>
+      <w:r>
+        <w:rPr>
+          <w:i/>
+          <w:iCs/>
+        </w:rPr>
+        <w:t xml:space="preserve"> </w:t>
+      </w:r>
+      <w:r>
+        <w:rPr>
+          <w:i/>
+          <w:iCs/>
+        </w:rPr>
+        <w:t xml:space="preserve">arctica) are disappearing from</w:t>
+      </w:r>
+      <w:r>
+        <w:rPr>
+          <w:i/>
+          <w:iCs/>
+        </w:rPr>
+        <w:t xml:space="preserve"> </w:t>
+      </w:r>
+      <w:r>
+        <w:rPr>
+          <w:i/>
+          <w:iCs/>
+        </w:rPr>
+        <w:t xml:space="preserve">Faroese</w:t>
+      </w:r>
+      <w:r>
+        <w:rPr>
+          <w:i/>
+          <w:iCs/>
+        </w:rPr>
+        <w:t xml:space="preserve"> </w:t>
+      </w:r>
+      <w:r>
+        <w:rPr>
+          <w:i/>
+          <w:iCs/>
+        </w:rPr>
+        <w:t xml:space="preserve">colonies’</w:t>
+      </w:r>
+      <w:r>
+        <w:t xml:space="preserve"> </w:t>
+      </w:r>
+      <w:r>
+        <w:t xml:space="preserve">(Version v1.0.0) [Computer software]. Zenodo.</w:t>
+      </w:r>
+      <w:r>
+        <w:t xml:space="preserve"> </w:t>
+      </w:r>
+      <w:hyperlink r:id="rId23">
+        <w:r>
+          <w:rPr>
+            <w:rStyle w:val="Hyperlink"/>
+          </w:rPr>
+          <w:t xml:space="preserve">https://doi.org/10.5281/ZENODO.21780561</w:t>
+        </w:r>
+      </w:hyperlink>
+    </w:p>
+    <w:bookmarkEnd w:id="24"/>
+    <w:bookmarkStart w:id="26" w:name="ref-baileyIncubationPatchPasserine1952"/>
+    <w:p>
+      <w:pPr>
+        <w:pStyle w:val="Bibliography"/>
+      </w:pPr>
+      <w:r>
         <w:t xml:space="preserve">Bailey, R. E. (1952). The</w:t>
       </w:r>
       <w:r>
@@ -1738,7 +1861,7 @@
       <w:r>
         <w:t xml:space="preserve"> </w:t>
       </w:r>
-      <w:hyperlink r:id="rId23">
+      <w:hyperlink r:id="rId25">
         <w:r>
           <w:rPr>
             <w:rStyle w:val="Hyperlink"/>
@@ -1747,8 +1870,8 @@
         </w:r>
       </w:hyperlink>
     </w:p>
-    <w:bookmarkEnd w:id="24"/>
-    <w:bookmarkStart w:id="26" w:name="X6fe9fda70bed21ba65d61585bcf1d825af477bf"/>
+    <w:bookmarkEnd w:id="26"/>
+    <w:bookmarkStart w:id="28" w:name="X6fe9fda70bed21ba65d61585bcf1d825af477bf"/>
     <w:p>
       <w:pPr>
         <w:pStyle w:val="Bibliography"/>
@@ -1816,7 +1939,7 @@
       <w:r>
         <w:t xml:space="preserve"> </w:t>
       </w:r>
-      <w:hyperlink r:id="rId25">
+      <w:hyperlink r:id="rId27">
         <w:r>
           <w:rPr>
             <w:rStyle w:val="Hyperlink"/>
@@ -1825,8 +1948,8 @@
         </w:r>
       </w:hyperlink>
     </w:p>
-    <w:bookmarkEnd w:id="26"/>
-    <w:bookmarkStart w:id="28" w:name="X2251d75557b56d22c3e2c47990efce73593f512"/>
+    <w:bookmarkEnd w:id="28"/>
+    <w:bookmarkStart w:id="30" w:name="X2251d75557b56d22c3e2c47990efce73593f512"/>
     <w:p>
       <w:pPr>
         <w:pStyle w:val="Bibliography"/>
@@ -1884,7 +2007,7 @@
       <w:r>
         <w:t xml:space="preserve"> </w:t>
       </w:r>
-      <w:hyperlink r:id="rId27">
+      <w:hyperlink r:id="rId29">
         <w:r>
           <w:rPr>
             <w:rStyle w:val="Hyperlink"/>
@@ -1893,8 +2016,8 @@
         </w:r>
       </w:hyperlink>
     </w:p>
-    <w:bookmarkEnd w:id="28"/>
-    <w:bookmarkStart w:id="30" w:name="ref-burknerBrmsPackageBayesian2017"/>
+    <w:bookmarkEnd w:id="30"/>
+    <w:bookmarkStart w:id="32" w:name="ref-burknerBrmsPackageBayesian2017"/>
     <w:p>
       <w:pPr>
         <w:pStyle w:val="Bibliography"/>
@@ -1973,7 +2096,7 @@
       <w:r>
         <w:t xml:space="preserve"> </w:t>
       </w:r>
-      <w:hyperlink r:id="rId29">
+      <w:hyperlink r:id="rId31">
         <w:r>
           <w:rPr>
             <w:rStyle w:val="Hyperlink"/>
@@ -1982,8 +2105,8 @@
         </w:r>
       </w:hyperlink>
     </w:p>
-    <w:bookmarkEnd w:id="30"/>
-    <w:bookmarkStart w:id="32" w:name="ref-burrLaterHigherLatitudes2016"/>
+    <w:bookmarkEnd w:id="32"/>
+    <w:bookmarkStart w:id="34" w:name="ref-burrLaterHigherLatitudes2016"/>
     <w:p>
       <w:pPr>
         <w:pStyle w:val="Bibliography"/>
@@ -2020,7 +2143,7 @@
       <w:r>
         <w:t xml:space="preserve"> </w:t>
       </w:r>
-      <w:hyperlink r:id="rId31">
+      <w:hyperlink r:id="rId33">
         <w:r>
           <w:rPr>
             <w:rStyle w:val="Hyperlink"/>
@@ -2029,8 +2152,8 @@
         </w:r>
       </w:hyperlink>
     </w:p>
-    <w:bookmarkEnd w:id="32"/>
-    <w:bookmarkStart w:id="34" w:name="ref-clairbauxNorthAtlanticWinter2021"/>
+    <w:bookmarkEnd w:id="34"/>
+    <w:bookmarkStart w:id="36" w:name="ref-clairbauxNorthAtlanticWinter2021"/>
     <w:p>
       <w:pPr>
         <w:pStyle w:val="Bibliography"/>
@@ -2079,7 +2202,7 @@
       <w:r>
         <w:t xml:space="preserve"> </w:t>
       </w:r>
-      <w:hyperlink r:id="rId33">
+      <w:hyperlink r:id="rId35">
         <w:r>
           <w:rPr>
             <w:rStyle w:val="Hyperlink"/>
@@ -2088,8 +2211,8 @@
         </w:r>
       </w:hyperlink>
     </w:p>
-    <w:bookmarkEnd w:id="34"/>
-    <w:bookmarkStart w:id="36" w:name="ref-diasThreatsSeabirdsGlobal2019"/>
+    <w:bookmarkEnd w:id="36"/>
+    <w:bookmarkStart w:id="38" w:name="ref-diasThreatsSeabirdsGlobal2019"/>
     <w:p>
       <w:pPr>
         <w:pStyle w:val="Bibliography"/>
@@ -2138,7 +2261,7 @@
       <w:r>
         <w:t xml:space="preserve"> </w:t>
       </w:r>
-      <w:hyperlink r:id="rId35">
+      <w:hyperlink r:id="rId37">
         <w:r>
           <w:rPr>
             <w:rStyle w:val="Hyperlink"/>
@@ -2147,8 +2270,8 @@
         </w:r>
       </w:hyperlink>
     </w:p>
-    <w:bookmarkEnd w:id="36"/>
-    <w:bookmarkStart w:id="38" w:name="ref-dohertyTestingLifeHistory2004"/>
+    <w:bookmarkEnd w:id="38"/>
+    <w:bookmarkStart w:id="40" w:name="ref-dohertyTestingLifeHistory2004"/>
     <w:p>
       <w:pPr>
         <w:pStyle w:val="Bibliography"/>
@@ -2185,7 +2308,7 @@
       <w:r>
         <w:t xml:space="preserve"> </w:t>
       </w:r>
-      <w:hyperlink r:id="rId37">
+      <w:hyperlink r:id="rId39">
         <w:r>
           <w:rPr>
             <w:rStyle w:val="Hyperlink"/>
@@ -2194,8 +2317,8 @@
         </w:r>
       </w:hyperlink>
     </w:p>
-    <w:bookmarkEnd w:id="38"/>
-    <w:bookmarkStart w:id="40" w:name="ref-durantRegimeShiftsBreeding2004"/>
+    <w:bookmarkEnd w:id="40"/>
+    <w:bookmarkStart w:id="42" w:name="ref-durantRegimeShiftsBreeding2004"/>
     <w:p>
       <w:pPr>
         <w:pStyle w:val="Bibliography"/>
@@ -2244,7 +2367,7 @@
       <w:r>
         <w:t xml:space="preserve"> </w:t>
       </w:r>
-      <w:hyperlink r:id="rId39">
+      <w:hyperlink r:id="rId41">
         <w:r>
           <w:rPr>
             <w:rStyle w:val="Hyperlink"/>
@@ -2253,8 +2376,8 @@
         </w:r>
       </w:hyperlink>
     </w:p>
-    <w:bookmarkEnd w:id="40"/>
-    <w:bookmarkStart w:id="41" w:name="ref-fayetLocalPreyShortages2021"/>
+    <w:bookmarkEnd w:id="42"/>
+    <w:bookmarkStart w:id="43" w:name="ref-fayetLocalPreyShortages2021"/>
     <w:p>
       <w:pPr>
         <w:pStyle w:val="Bibliography"/>
@@ -2301,8 +2424,8 @@
         <w:t xml:space="preserve">, 1152–1164.</w:t>
       </w:r>
     </w:p>
-    <w:bookmarkEnd w:id="41"/>
-    <w:bookmarkStart w:id="43" w:name="X402cb5e1a4e69ff49497d0188bad825f79b15d6"/>
+    <w:bookmarkEnd w:id="43"/>
+    <w:bookmarkStart w:id="45" w:name="X402cb5e1a4e69ff49497d0188bad825f79b15d6"/>
     <w:p>
       <w:pPr>
         <w:pStyle w:val="Bibliography"/>
@@ -2348,7 +2471,7 @@
       <w:r>
         <w:t xml:space="preserve"> </w:t>
       </w:r>
-      <w:hyperlink r:id="rId42">
+      <w:hyperlink r:id="rId44">
         <w:r>
           <w:rPr>
             <w:rStyle w:val="Hyperlink"/>
@@ -2357,8 +2480,8 @@
         </w:r>
       </w:hyperlink>
     </w:p>
-    <w:bookmarkEnd w:id="43"/>
-    <w:bookmarkStart w:id="45" w:name="X33c5e51ec6e1feb638e31c81b30fec3bad61a46"/>
+    <w:bookmarkEnd w:id="45"/>
+    <w:bookmarkStart w:id="47" w:name="X33c5e51ec6e1feb638e31c81b30fec3bad61a46"/>
     <w:p>
       <w:pPr>
         <w:pStyle w:val="Bibliography"/>
@@ -2395,7 +2518,7 @@
       <w:r>
         <w:t xml:space="preserve"> </w:t>
       </w:r>
-      <w:hyperlink r:id="rId44">
+      <w:hyperlink r:id="rId46">
         <w:r>
           <w:rPr>
             <w:rStyle w:val="Hyperlink"/>
@@ -2404,8 +2527,8 @@
         </w:r>
       </w:hyperlink>
     </w:p>
-    <w:bookmarkEnd w:id="45"/>
-    <w:bookmarkStart w:id="46" w:name="Xd2c1001e50c6a03f5980b48bf021065e127b4b3"/>
+    <w:bookmarkEnd w:id="47"/>
+    <w:bookmarkStart w:id="48" w:name="Xd2c1001e50c6a03f5980b48bf021065e127b4b3"/>
     <w:p>
       <w:pPr>
         <w:pStyle w:val="Bibliography"/>
@@ -2486,8 +2609,8 @@
         <w:t xml:space="preserve">(p. 177). Fróðskapur, Faroe University Press.</w:t>
       </w:r>
     </w:p>
-    <w:bookmarkEnd w:id="46"/>
-    <w:bookmarkStart w:id="48" w:name="X686eab3f81361263a84b2098b98864d463c743b"/>
+    <w:bookmarkEnd w:id="48"/>
+    <w:bookmarkStart w:id="50" w:name="X686eab3f81361263a84b2098b98864d463c743b"/>
     <w:p>
       <w:pPr>
         <w:pStyle w:val="Bibliography"/>
@@ -2524,7 +2647,7 @@
       <w:r>
         <w:t xml:space="preserve"> </w:t>
       </w:r>
-      <w:hyperlink r:id="rId47">
+      <w:hyperlink r:id="rId49">
         <w:r>
           <w:rPr>
             <w:rStyle w:val="Hyperlink"/>
@@ -2533,8 +2656,8 @@
         </w:r>
       </w:hyperlink>
     </w:p>
-    <w:bookmarkEnd w:id="48"/>
-    <w:bookmarkStart w:id="49" w:name="ref-jensenPuffinFowlingaFowling2010"/>
+    <w:bookmarkEnd w:id="50"/>
+    <w:bookmarkStart w:id="51" w:name="ref-jensenPuffinFowlingaFowling2010"/>
     <w:p>
       <w:pPr>
         <w:pStyle w:val="Bibliography"/>
@@ -2591,8 +2714,8 @@
         <w:t xml:space="preserve">. Føroya Skúlabókagrunnur.</w:t>
       </w:r>
     </w:p>
-    <w:bookmarkEnd w:id="49"/>
-    <w:bookmarkStart w:id="50" w:name="ref-jensenListBirdsSeen2005"/>
+    <w:bookmarkEnd w:id="51"/>
+    <w:bookmarkStart w:id="52" w:name="ref-jensenListBirdsSeen2005"/>
     <w:p>
       <w:pPr>
         <w:pStyle w:val="Bibliography"/>
@@ -2651,8 +2774,8 @@
         <w:t xml:space="preserve">. Føroya Náttúrugripasavn, Tórshavn, Faroe Islands.</w:t>
       </w:r>
     </w:p>
-    <w:bookmarkEnd w:id="50"/>
-    <w:bookmarkStart w:id="51" w:name="ref-jensenTraditionsPuffinFowling2020"/>
+    <w:bookmarkEnd w:id="52"/>
+    <w:bookmarkStart w:id="53" w:name="ref-jensenTraditionsPuffinFowling2020"/>
     <w:p>
       <w:pPr>
         <w:pStyle w:val="Bibliography"/>
@@ -2699,8 +2822,8 @@
         <w:t xml:space="preserve">, 3–17.</w:t>
       </w:r>
     </w:p>
-    <w:bookmarkEnd w:id="51"/>
-    <w:bookmarkStart w:id="53" w:name="X289cc0e6e2d6f2de639c6553ec3bb635a7ae663"/>
+    <w:bookmarkEnd w:id="53"/>
+    <w:bookmarkStart w:id="55" w:name="X289cc0e6e2d6f2de639c6553ec3bb635a7ae663"/>
     <w:p>
       <w:pPr>
         <w:pStyle w:val="Bibliography"/>
@@ -2749,7 +2872,7 @@
       <w:r>
         <w:t xml:space="preserve"> </w:t>
       </w:r>
-      <w:hyperlink r:id="rId52">
+      <w:hyperlink r:id="rId54">
         <w:r>
           <w:rPr>
             <w:rStyle w:val="Hyperlink"/>
@@ -2758,8 +2881,8 @@
         </w:r>
       </w:hyperlink>
     </w:p>
-    <w:bookmarkEnd w:id="53"/>
-    <w:bookmarkStart w:id="55" w:name="ref-johnson2024icelandic"/>
+    <w:bookmarkEnd w:id="55"/>
+    <w:bookmarkStart w:id="57" w:name="ref-johnson2024icelandic"/>
     <w:p>
       <w:pPr>
         <w:pStyle w:val="Bibliography"/>
@@ -2783,7 +2906,7 @@
       <w:r>
         <w:t xml:space="preserve"> </w:t>
       </w:r>
-      <w:hyperlink r:id="rId54">
+      <w:hyperlink r:id="rId56">
         <w:r>
           <w:rPr>
             <w:rStyle w:val="Hyperlink"/>
@@ -2792,8 +2915,8 @@
         </w:r>
       </w:hyperlink>
     </w:p>
-    <w:bookmarkEnd w:id="55"/>
-    <w:bookmarkStart w:id="57" w:name="ref-jonesIncubationPatchBirds1971"/>
+    <w:bookmarkEnd w:id="57"/>
+    <w:bookmarkStart w:id="59" w:name="ref-jonesIncubationPatchBirds1971"/>
     <w:p>
       <w:pPr>
         <w:pStyle w:val="Bibliography"/>
@@ -2851,7 +2974,7 @@
       <w:r>
         <w:t xml:space="preserve"> </w:t>
       </w:r>
-      <w:hyperlink r:id="rId56">
+      <w:hyperlink r:id="rId58">
         <w:r>
           <w:rPr>
             <w:rStyle w:val="Hyperlink"/>
@@ -2860,8 +2983,8 @@
         </w:r>
       </w:hyperlink>
     </w:p>
-    <w:bookmarkEnd w:id="57"/>
-    <w:bookmarkStart w:id="58" w:name="Xe19625febeb906ccdb6e58cd53cb47af33dcf28"/>
+    <w:bookmarkEnd w:id="59"/>
+    <w:bookmarkStart w:id="60" w:name="Xe19625febeb906ccdb6e58cd53cb47af33dcf28"/>
     <w:p>
       <w:pPr>
         <w:pStyle w:val="Bibliography"/>
@@ -2870,8 +2993,8 @@
         <w:t xml:space="preserve">Løgtingslóg Um Fuglaveiðu, Sum Seinast Broytt Við Løgtingslóg Nr. 70 Frá 22. Mai 2023 (1984).</w:t>
       </w:r>
     </w:p>
-    <w:bookmarkEnd w:id="58"/>
-    <w:bookmarkStart w:id="60" w:name="ref-lowtherAtlanticPuffinFratercula2020"/>
+    <w:bookmarkEnd w:id="60"/>
+    <w:bookmarkStart w:id="62" w:name="ref-lowtherAtlanticPuffinFratercula2020"/>
     <w:p>
       <w:pPr>
         <w:pStyle w:val="Bibliography"/>
@@ -2904,7 +3027,7 @@
       <w:r>
         <w:t xml:space="preserve"> </w:t>
       </w:r>
-      <w:hyperlink r:id="rId59">
+      <w:hyperlink r:id="rId61">
         <w:r>
           <w:rPr>
             <w:rStyle w:val="Hyperlink"/>
@@ -2913,8 +3036,8 @@
         </w:r>
       </w:hyperlink>
     </w:p>
-    <w:bookmarkEnd w:id="60"/>
-    <w:bookmarkStart w:id="62" w:name="X207bec76f29f8d8311150c8279e9cc679159524"/>
+    <w:bookmarkEnd w:id="62"/>
+    <w:bookmarkStart w:id="64" w:name="X207bec76f29f8d8311150c8279e9cc679159524"/>
     <w:p>
       <w:pPr>
         <w:pStyle w:val="Bibliography"/>
@@ -3014,7 +3137,7 @@
       <w:r>
         <w:t xml:space="preserve"> </w:t>
       </w:r>
-      <w:hyperlink r:id="rId61">
+      <w:hyperlink r:id="rId63">
         <w:r>
           <w:rPr>
             <w:rStyle w:val="Hyperlink"/>
@@ -3023,8 +3146,8 @@
         </w:r>
       </w:hyperlink>
     </w:p>
-    <w:bookmarkEnd w:id="62"/>
-    <w:bookmarkStart w:id="64" w:name="X958f21470482a6a06ce614515743210bd9f3c46"/>
+    <w:bookmarkEnd w:id="64"/>
+    <w:bookmarkStart w:id="66" w:name="X958f21470482a6a06ce614515743210bd9f3c46"/>
     <w:p>
       <w:pPr>
         <w:pStyle w:val="Bibliography"/>
@@ -3127,7 +3250,7 @@
       <w:r>
         <w:t xml:space="preserve"> </w:t>
       </w:r>
-      <w:hyperlink r:id="rId63">
+      <w:hyperlink r:id="rId65">
         <w:r>
           <w:rPr>
             <w:rStyle w:val="Hyperlink"/>
@@ -3136,8 +3259,8 @@
         </w:r>
       </w:hyperlink>
     </w:p>
-    <w:bookmarkEnd w:id="64"/>
-    <w:bookmarkStart w:id="66" w:name="ref-milesDeclineAtlanticPuffin2015"/>
+    <w:bookmarkEnd w:id="66"/>
+    <w:bookmarkStart w:id="68" w:name="ref-milesDeclineAtlanticPuffin2015"/>
     <w:p>
       <w:pPr>
         <w:pStyle w:val="Bibliography"/>
@@ -3216,116 +3339,12 @@
       <w:r>
         <w:t xml:space="preserve"> </w:t>
       </w:r>
-      <w:hyperlink r:id="rId65">
+      <w:hyperlink r:id="rId67">
         <w:r>
           <w:rPr>
             <w:rStyle w:val="Hyperlink"/>
           </w:rPr>
           <w:t xml:space="preserve">https://doi.org/10.1371/journal.pone.0131527</w:t>
-        </w:r>
-      </w:hyperlink>
-    </w:p>
-    <w:bookmarkEnd w:id="66"/>
-    <w:bookmarkStart w:id="68" w:name="ref-rcoreteamRLanguageEnvironment2026"/>
-    <w:p>
-      <w:pPr>
-        <w:pStyle w:val="Bibliography"/>
-      </w:pPr>
-      <w:r>
-        <w:t xml:space="preserve">R Core Team. (2026).</w:t>
-      </w:r>
-      <w:r>
-        <w:t xml:space="preserve"> </w:t>
-      </w:r>
-      <w:r>
-        <w:rPr>
-          <w:i/>
-          <w:iCs/>
-        </w:rPr>
-        <w:t xml:space="preserve">R:</w:t>
-      </w:r>
-      <w:r>
-        <w:rPr>
-          <w:i/>
-          <w:iCs/>
-        </w:rPr>
-        <w:t xml:space="preserve"> </w:t>
-      </w:r>
-      <w:r>
-        <w:rPr>
-          <w:i/>
-          <w:iCs/>
-        </w:rPr>
-        <w:t xml:space="preserve">A Language</w:t>
-      </w:r>
-      <w:r>
-        <w:rPr>
-          <w:i/>
-          <w:iCs/>
-        </w:rPr>
-        <w:t xml:space="preserve"> </w:t>
-      </w:r>
-      <w:r>
-        <w:rPr>
-          <w:i/>
-          <w:iCs/>
-        </w:rPr>
-        <w:t xml:space="preserve">and</w:t>
-      </w:r>
-      <w:r>
-        <w:rPr>
-          <w:i/>
-          <w:iCs/>
-        </w:rPr>
-        <w:t xml:space="preserve"> </w:t>
-      </w:r>
-      <w:r>
-        <w:rPr>
-          <w:i/>
-          <w:iCs/>
-        </w:rPr>
-        <w:t xml:space="preserve">Environment</w:t>
-      </w:r>
-      <w:r>
-        <w:rPr>
-          <w:i/>
-          <w:iCs/>
-        </w:rPr>
-        <w:t xml:space="preserve"> </w:t>
-      </w:r>
-      <w:r>
-        <w:rPr>
-          <w:i/>
-          <w:iCs/>
-        </w:rPr>
-        <w:t xml:space="preserve">for</w:t>
-      </w:r>
-      <w:r>
-        <w:rPr>
-          <w:i/>
-          <w:iCs/>
-        </w:rPr>
-        <w:t xml:space="preserve"> </w:t>
-      </w:r>
-      <w:r>
-        <w:rPr>
-          <w:i/>
-          <w:iCs/>
-        </w:rPr>
-        <w:t xml:space="preserve">Statistical Computing</w:t>
-      </w:r>
-      <w:r>
-        <w:t xml:space="preserve">. R Foundation for Statistical Computing.</w:t>
-      </w:r>
-      <w:r>
-        <w:t xml:space="preserve"> </w:t>
-      </w:r>
-      <w:hyperlink r:id="rId67">
-        <w:r>
-          <w:rPr>
-            <w:rStyle w:val="Hyperlink"/>
-          </w:rPr>
-          <w:t xml:space="preserve">https://doi.org/10.32614/R.manuals</w:t>
         </w:r>
       </w:hyperlink>
     </w:p>

</xml_diff>

<commit_message>
added faroese abstract, added reference to cancellation guga hunt, added MG & KP to acknowledgements, updated author contributions
</commit_message>
<xml_diff>
--- a/manuscript/manuscript.docx
+++ b/manuscript/manuscript.docx
@@ -134,7 +134,35 @@
         <w:t xml:space="preserve">Føroyar</w:t>
       </w:r>
       <w:r>
-        <w:t xml:space="preserve">, even reduced harvesting is likely unsustainable under currect conditions.</w:t>
+        <w:t xml:space="preserve">, even reduced harvesting is likely unsustainable under current conditions.</w:t>
+      </w:r>
+    </w:p>
+    <w:bookmarkEnd w:id="9"/>
+    <w:bookmarkStart w:id="10" w:name="samandráttur"/>
+    <w:p>
+      <w:pPr>
+        <w:pStyle w:val="Heading1"/>
+      </w:pPr>
+      <w:r>
+        <w:t xml:space="preserve">SAMANDRÁTTUR</w:t>
+      </w:r>
+    </w:p>
+    <w:p>
+      <w:pPr>
+        <w:pStyle w:val="FirstParagraph"/>
+      </w:pPr>
+      <w:r>
+        <w:t xml:space="preserve">Áhaldandi veðurlagsbroytingar og øktar umhvørvisbroytingar av menniskjaávum hava við sær týðiligar broytingar í talinum á sjófugli. Eitt av ávirkaðu fuglasløgunum er lundin (</w:t>
+      </w:r>
+      <w:r>
+        <w:rPr>
+          <w:i/>
+          <w:iCs/>
+        </w:rPr>
+        <w:t xml:space="preserve">Fratercula arctica</w:t>
+      </w:r>
+      <w:r>
+        <w:t xml:space="preserve">), sum er í minking í Norðuratlantshavi. Samstundis sum ein stórur partur av minkingini kemur av óbeinleiðis ávirkan, til dømis tí at minni føði hevur við sær, at stórur partur av ynglingini fer fyri skeytið, kunnu beinleiðis hóttanir, herundir lundaveiða, geva teimum longu hóttu lundastovnunum banahøggið. Fleygaðir lundar geva okkum eitt einastandandi høvi at kanna ein sunnan part av lundastovninum bæði inn- og útvortis. Her hava vit kannað 13 ára dátur (1995-2008) um lundabøgur, sum vórðu fleygaðar í Føroyum, við tí fyri eyga at vita, um lutfallið av váttaðum ynglifugl (t.e. tær lundabøgurnar, sum hava úttambaðar eggjaleiðarar, sum vísa, at tær hava vorpið í minsta lagi eina ferð) í kannaðu sýnunum øktist yvir tíð. Vit taldu eisini upp bølingarblettir sum tekin um yngling í kanningarárinum, av tí at sýnini vórðu tikin, eftir at eggini vóru klakt, og tá eiga hormonellir bølingarblettir (uttan virkna yngliroynd) at vera horvnir. Vit komu fram til, at lutfallið av váttaðum ynglifugli øktist frá umleið 15 % í byrjanini av kannaða tíðarskeiðinum til 78 % í 2008, og at lutfallið av váttaðum ynglifugli eisini øktist millum teir fuglarnar, sum ikki høvdu bølingarblett. Yvirhøvur kundu vit vísa á, at ungfuglar, sum ikki høvdu ynglað enn, hvurvu úr sýnunum, og hetta bendir á stórar trupulleikar hjá stovninum at seta nýggjan ynglifugl við. Tað er neyvan veiðan, sum er høvuðsorsøkin til, at stovnurin minkar í Føroyum, men sjálvt avmarkað veiða er óburðardygg undir núverandi umstøðum.</w:t>
       </w:r>
     </w:p>
     <w:p>
@@ -155,8 +183,8 @@
         <w:t xml:space="preserve">demographics, seabirds, traditional harvest, recruitment, brood patch, seabird conservation</w:t>
       </w:r>
     </w:p>
-    <w:bookmarkEnd w:id="9"/>
-    <w:bookmarkStart w:id="10" w:name="introduction"/>
+    <w:bookmarkEnd w:id="10"/>
+    <w:bookmarkStart w:id="11" w:name="introduction"/>
     <w:p>
       <w:pPr>
         <w:pStyle w:val="Heading1"/>
@@ -602,8 +630,8 @@
         <w:t xml:space="preserve">, we assumed that, at the time of the puffin hunt, prospecting and failed breeders would have refeathered their brood patch while actively incubating birds still retained theirs. We predicted that birds of breeding age would be less likely to have a brood patch later in the study period, indicating increased breeding failures or an increase in birds foregoing breeding.</w:t>
       </w:r>
     </w:p>
-    <w:bookmarkEnd w:id="10"/>
-    <w:bookmarkStart w:id="11" w:name="methods"/>
+    <w:bookmarkEnd w:id="11"/>
+    <w:bookmarkStart w:id="12" w:name="methods"/>
     <w:p>
       <w:pPr>
         <w:pStyle w:val="Heading1"/>
@@ -786,17 +814,7 @@
         <w:t xml:space="preserve"> </w:t>
       </w:r>
       <w:r>
-        <w:t xml:space="preserve">(</w:t>
-      </w:r>
-      <w:r>
-        <w:rPr>
-          <w:b/>
-          <w:bCs/>
-        </w:rPr>
-        <w:t xml:space="preserve">rcoreteamRLanguageEnvironment2026?</w:t>
-      </w:r>
-      <w:r>
-        <w:t xml:space="preserve">)</w:t>
+        <w:t xml:space="preserve">R Core Team (2026)</w:t>
       </w:r>
       <w:r>
         <w:t xml:space="preserve">] with breeding status (0 = never bred; 1 = has bred) as response variable. We included study year and brood patch presence (0 = absent; 1 = present) with an interaction as covariates. We used weakly informative priors: a normal (0, 1.5) prior on the brood patch presence and year × brood patch presence interaction, a more skeptical normal (0, 1) prior on the year trend, and the default Student-t (3, 0, 2.5) prior on the intercept. We centered year around the mean, and scaled it in decades, so the year prior constrains the plausible per-decade change in breeding probability. We confirmed that these priors implied plausible values using prior predictive checks [</w:t>
@@ -1029,8 +1047,8 @@
         <w:t xml:space="preserve">As a robustness check, we tested whether brood patch detectability drifted over time within confirmed breeding-age females, with a second GLM with brood patch presence as response variable and year as covariate, including only breeding-age females (n = 469). We used the same priors as for the full model, excluding the interaction term. As a second robustness check to confirm that the low sample size (n = 5) in 2007 did not have an undue effect on the overall outcome, we refit the full model excluding 2007.</w:t>
       </w:r>
     </w:p>
-    <w:bookmarkEnd w:id="11"/>
-    <w:bookmarkStart w:id="12" w:name="results"/>
+    <w:bookmarkEnd w:id="12"/>
+    <w:bookmarkStart w:id="13" w:name="results"/>
     <w:p>
       <w:pPr>
         <w:pStyle w:val="Heading1"/>
@@ -1159,8 +1177,8 @@
         <w:t xml:space="preserve">). Removing 2007 did not change the model predictions (Δ odds ratio, full model minus 2007-excluded refit: intercept +0.00, year +0.00, brood patch presence -0.06, interaction +0.00).</w:t>
       </w:r>
     </w:p>
-    <w:bookmarkEnd w:id="12"/>
-    <w:bookmarkStart w:id="13" w:name="discussion"/>
+    <w:bookmarkEnd w:id="13"/>
+    <w:bookmarkStart w:id="14" w:name="discussion"/>
     <w:p>
       <w:pPr>
         <w:pStyle w:val="Heading1"/>
@@ -1400,11 +1418,49 @@
         <w:t xml:space="preserve">(Johnson et al., 2024)</w:t>
       </w:r>
       <w:r>
+        <w:t xml:space="preserve">. In Scotland, the traditional</w:t>
+      </w:r>
+      <w:r>
+        <w:t xml:space="preserve"> </w:t>
+      </w:r>
+      <w:r>
+        <w:rPr>
+          <w:i/>
+          <w:iCs/>
+        </w:rPr>
+        <w:t xml:space="preserve">guga</w:t>
+      </w:r>
+      <w:r>
+        <w:t xml:space="preserve"> </w:t>
+      </w:r>
+      <w:r>
+        <w:t xml:space="preserve">(juvenile Northern Gannet</w:t>
+      </w:r>
+      <w:r>
+        <w:t xml:space="preserve"> </w:t>
+      </w:r>
+      <w:r>
+        <w:rPr>
+          <w:i/>
+          <w:iCs/>
+        </w:rPr>
+        <w:t xml:space="preserve">Morus bassanus</w:t>
+      </w:r>
+      <w:r>
+        <w:t xml:space="preserve">) hunting licence was rejected this year as the requested harvest was deemed likely to negatively affect the population</w:t>
+      </w:r>
+      <w:r>
+        <w:t xml:space="preserve"> </w:t>
+      </w:r>
+      <w:r>
+        <w:t xml:space="preserve">(NatureScot, 2026)</w:t>
+      </w:r>
+      <w:r>
         <w:t xml:space="preserve">.</w:t>
       </w:r>
     </w:p>
-    <w:bookmarkEnd w:id="13"/>
-    <w:bookmarkStart w:id="14" w:name="acknowledgements"/>
+    <w:bookmarkEnd w:id="14"/>
+    <w:bookmarkStart w:id="15" w:name="acknowledgements"/>
     <w:p>
       <w:pPr>
         <w:pStyle w:val="Heading1"/>
@@ -1418,11 +1474,11 @@
         <w:pStyle w:val="FirstParagraph"/>
       </w:pPr>
       <w:r>
-        <w:t xml:space="preserve">We would like to thank René Hansen for collecting and sharing the harvest numbers and Trevor MacLaurin for double checking our statistical methods. Most importantly, we would like to thank the hunters who shared puffins for use in this study. Puffins were obtained using private funds and a small contribution from Havstovan - Faroe Marine Research Institute.</w:t>
-      </w:r>
-    </w:p>
-    <w:bookmarkEnd w:id="14"/>
-    <w:bookmarkStart w:id="15" w:name="author-contributions"/>
+        <w:t xml:space="preserve">We would like to thank René Hansen for collecting and sharing the harvest numbers and Trevor MacLaurin for double checking our statistical methods. We would also like to thank Kristina Petersen and Marita Gulklett for their help translating the abstract to Faroese. Most importantly, we would like to thank the hunters who shared puffins for use in this study. Puffins were obtained using private funds and a small contribution from Havstovan - Faroe Marine Research Institute.</w:t>
+      </w:r>
+    </w:p>
+    <w:bookmarkEnd w:id="15"/>
+    <w:bookmarkStart w:id="16" w:name="author-contributions"/>
     <w:p>
       <w:pPr>
         <w:pStyle w:val="Heading1"/>
@@ -1436,19 +1492,11 @@
         <w:pStyle w:val="FirstParagraph"/>
       </w:pPr>
       <w:r>
-        <w:t xml:space="preserve">AA: conceptualisation; data curation; formal analysis; methodology; validation; visualisation; writing - original draft</w:t>
-      </w:r>
-    </w:p>
-    <w:p>
-      <w:pPr>
-        <w:pStyle w:val="BodyText"/>
-      </w:pPr>
-      <w:r>
-        <w:t xml:space="preserve">JKJ: conceptualisation; data curation; investigation; methodology; resources; writing - review and editing</w:t>
-      </w:r>
-    </w:p>
-    <w:bookmarkEnd w:id="15"/>
-    <w:bookmarkStart w:id="18" w:name="data-and-code-availability"/>
+        <w:t xml:space="preserve">Conceptualization: AA, JKJ. Data curation: AA, JKJ. Formal analysis: AA. Investigation: JKJ. Methodology: AA, JKJ. Resources: JKJ. Validation: AA. Visualization: AA. Writing—original draft: AA. Writing—review &amp; editing: JKJ.</w:t>
+      </w:r>
+    </w:p>
+    <w:bookmarkEnd w:id="16"/>
+    <w:bookmarkStart w:id="19" w:name="data-and-code-availability"/>
     <w:p>
       <w:pPr>
         <w:pStyle w:val="Heading1"/>
@@ -1467,7 +1515,7 @@
       <w:r>
         <w:t xml:space="preserve"> </w:t>
       </w:r>
-      <w:hyperlink r:id="rId16">
+      <w:hyperlink r:id="rId17">
         <w:r>
           <w:rPr>
             <w:rStyle w:val="Hyperlink"/>
@@ -1481,7 +1529,7 @@
       <w:r>
         <w:t xml:space="preserve"> </w:t>
       </w:r>
-      <w:hyperlink r:id="rId17">
+      <w:hyperlink r:id="rId18">
         <w:r>
           <w:rPr>
             <w:rStyle w:val="Hyperlink"/>
@@ -1499,8 +1547,8 @@
         <w:t xml:space="preserve">.</w:t>
       </w:r>
     </w:p>
-    <w:bookmarkEnd w:id="18"/>
-    <w:bookmarkStart w:id="102" w:name="references"/>
+    <w:bookmarkEnd w:id="19"/>
+    <w:bookmarkStart w:id="107" w:name="references"/>
     <w:p>
       <w:pPr>
         <w:pStyle w:val="Heading1"/>
@@ -1509,8 +1557,8 @@
         <w:t xml:space="preserve">REFERENCES</w:t>
       </w:r>
     </w:p>
-    <w:bookmarkStart w:id="79" w:name="refs"/>
-    <w:bookmarkStart w:id="20" w:name="ref-ashcroftSurvivalRatesBreeding1979"/>
+    <w:bookmarkStart w:id="84" w:name="refs"/>
+    <w:bookmarkStart w:id="21" w:name="ref-ashcroftSurvivalRatesBreeding1979"/>
     <w:p>
       <w:pPr>
         <w:pStyle w:val="Bibliography"/>
@@ -1601,7 +1649,7 @@
       <w:r>
         <w:t xml:space="preserve"> </w:t>
       </w:r>
-      <w:hyperlink r:id="rId19">
+      <w:hyperlink r:id="rId20">
         <w:r>
           <w:rPr>
             <w:rStyle w:val="Hyperlink"/>
@@ -1610,8 +1658,8 @@
         </w:r>
       </w:hyperlink>
     </w:p>
-    <w:bookmarkEnd w:id="20"/>
-    <w:bookmarkStart w:id="22" w:name="ref-ausemsVariationFoodAvailability2026"/>
+    <w:bookmarkEnd w:id="21"/>
+    <w:bookmarkStart w:id="23" w:name="ref-ausemsVariationFoodAvailability2026"/>
     <w:p>
       <w:pPr>
         <w:pStyle w:val="Bibliography"/>
@@ -1686,7 +1734,7 @@
       <w:r>
         <w:t xml:space="preserve"> </w:t>
       </w:r>
-      <w:hyperlink r:id="rId21">
+      <w:hyperlink r:id="rId22">
         <w:r>
           <w:rPr>
             <w:rStyle w:val="Hyperlink"/>
@@ -1695,8 +1743,8 @@
         </w:r>
       </w:hyperlink>
     </w:p>
-    <w:bookmarkEnd w:id="22"/>
-    <w:bookmarkStart w:id="24" w:name="X5001aa68545cec2af7068c5799e4bc0a6cad2bc"/>
+    <w:bookmarkEnd w:id="23"/>
+    <w:bookmarkStart w:id="25" w:name="X5001aa68545cec2af7068c5799e4bc0a6cad2bc"/>
     <w:p>
       <w:pPr>
         <w:pStyle w:val="Bibliography"/>
@@ -1788,12 +1836,12 @@
         <w:t xml:space="preserve"> </w:t>
       </w:r>
       <w:r>
-        <w:t xml:space="preserve">(Version v1.0.0) [Computer software]. Zenodo.</w:t>
-      </w:r>
-      <w:r>
-        <w:t xml:space="preserve"> </w:t>
-      </w:r>
-      <w:hyperlink r:id="rId23">
+        <w:t xml:space="preserve">(Version v1.0.0) [Dataset]. Zenodo.</w:t>
+      </w:r>
+      <w:r>
+        <w:t xml:space="preserve"> </w:t>
+      </w:r>
+      <w:hyperlink r:id="rId24">
         <w:r>
           <w:rPr>
             <w:rStyle w:val="Hyperlink"/>
@@ -1802,8 +1850,8 @@
         </w:r>
       </w:hyperlink>
     </w:p>
-    <w:bookmarkEnd w:id="24"/>
-    <w:bookmarkStart w:id="26" w:name="ref-baileyIncubationPatchPasserine1952"/>
+    <w:bookmarkEnd w:id="25"/>
+    <w:bookmarkStart w:id="27" w:name="ref-baileyIncubationPatchPasserine1952"/>
     <w:p>
       <w:pPr>
         <w:pStyle w:val="Bibliography"/>
@@ -1861,7 +1909,7 @@
       <w:r>
         <w:t xml:space="preserve"> </w:t>
       </w:r>
-      <w:hyperlink r:id="rId25">
+      <w:hyperlink r:id="rId26">
         <w:r>
           <w:rPr>
             <w:rStyle w:val="Hyperlink"/>
@@ -1870,8 +1918,8 @@
         </w:r>
       </w:hyperlink>
     </w:p>
-    <w:bookmarkEnd w:id="26"/>
-    <w:bookmarkStart w:id="28" w:name="X6fe9fda70bed21ba65d61585bcf1d825af477bf"/>
+    <w:bookmarkEnd w:id="27"/>
+    <w:bookmarkStart w:id="29" w:name="X6fe9fda70bed21ba65d61585bcf1d825af477bf"/>
     <w:p>
       <w:pPr>
         <w:pStyle w:val="Bibliography"/>
@@ -1939,7 +1987,7 @@
       <w:r>
         <w:t xml:space="preserve"> </w:t>
       </w:r>
-      <w:hyperlink r:id="rId27">
+      <w:hyperlink r:id="rId28">
         <w:r>
           <w:rPr>
             <w:rStyle w:val="Hyperlink"/>
@@ -1948,8 +1996,8 @@
         </w:r>
       </w:hyperlink>
     </w:p>
-    <w:bookmarkEnd w:id="28"/>
-    <w:bookmarkStart w:id="30" w:name="X2251d75557b56d22c3e2c47990efce73593f512"/>
+    <w:bookmarkEnd w:id="29"/>
+    <w:bookmarkStart w:id="31" w:name="X2251d75557b56d22c3e2c47990efce73593f512"/>
     <w:p>
       <w:pPr>
         <w:pStyle w:val="Bibliography"/>
@@ -2007,7 +2055,7 @@
       <w:r>
         <w:t xml:space="preserve"> </w:t>
       </w:r>
-      <w:hyperlink r:id="rId29">
+      <w:hyperlink r:id="rId30">
         <w:r>
           <w:rPr>
             <w:rStyle w:val="Hyperlink"/>
@@ -2016,8 +2064,8 @@
         </w:r>
       </w:hyperlink>
     </w:p>
-    <w:bookmarkEnd w:id="30"/>
-    <w:bookmarkStart w:id="32" w:name="ref-burknerBrmsPackageBayesian2017"/>
+    <w:bookmarkEnd w:id="31"/>
+    <w:bookmarkStart w:id="33" w:name="ref-burknerBrmsPackageBayesian2017"/>
     <w:p>
       <w:pPr>
         <w:pStyle w:val="Bibliography"/>
@@ -2096,7 +2144,7 @@
       <w:r>
         <w:t xml:space="preserve"> </w:t>
       </w:r>
-      <w:hyperlink r:id="rId31">
+      <w:hyperlink r:id="rId32">
         <w:r>
           <w:rPr>
             <w:rStyle w:val="Hyperlink"/>
@@ -2105,8 +2153,8 @@
         </w:r>
       </w:hyperlink>
     </w:p>
-    <w:bookmarkEnd w:id="32"/>
-    <w:bookmarkStart w:id="34" w:name="ref-burrLaterHigherLatitudes2016"/>
+    <w:bookmarkEnd w:id="33"/>
+    <w:bookmarkStart w:id="35" w:name="ref-burrLaterHigherLatitudes2016"/>
     <w:p>
       <w:pPr>
         <w:pStyle w:val="Bibliography"/>
@@ -2143,7 +2191,7 @@
       <w:r>
         <w:t xml:space="preserve"> </w:t>
       </w:r>
-      <w:hyperlink r:id="rId33">
+      <w:hyperlink r:id="rId34">
         <w:r>
           <w:rPr>
             <w:rStyle w:val="Hyperlink"/>
@@ -2152,8 +2200,8 @@
         </w:r>
       </w:hyperlink>
     </w:p>
-    <w:bookmarkEnd w:id="34"/>
-    <w:bookmarkStart w:id="36" w:name="ref-clairbauxNorthAtlanticWinter2021"/>
+    <w:bookmarkEnd w:id="35"/>
+    <w:bookmarkStart w:id="37" w:name="ref-clairbauxNorthAtlanticWinter2021"/>
     <w:p>
       <w:pPr>
         <w:pStyle w:val="Bibliography"/>
@@ -2202,7 +2250,7 @@
       <w:r>
         <w:t xml:space="preserve"> </w:t>
       </w:r>
-      <w:hyperlink r:id="rId35">
+      <w:hyperlink r:id="rId36">
         <w:r>
           <w:rPr>
             <w:rStyle w:val="Hyperlink"/>
@@ -2211,8 +2259,8 @@
         </w:r>
       </w:hyperlink>
     </w:p>
-    <w:bookmarkEnd w:id="36"/>
-    <w:bookmarkStart w:id="38" w:name="ref-diasThreatsSeabirdsGlobal2019"/>
+    <w:bookmarkEnd w:id="37"/>
+    <w:bookmarkStart w:id="39" w:name="ref-diasThreatsSeabirdsGlobal2019"/>
     <w:p>
       <w:pPr>
         <w:pStyle w:val="Bibliography"/>
@@ -2261,7 +2309,7 @@
       <w:r>
         <w:t xml:space="preserve"> </w:t>
       </w:r>
-      <w:hyperlink r:id="rId37">
+      <w:hyperlink r:id="rId38">
         <w:r>
           <w:rPr>
             <w:rStyle w:val="Hyperlink"/>
@@ -2270,8 +2318,8 @@
         </w:r>
       </w:hyperlink>
     </w:p>
-    <w:bookmarkEnd w:id="38"/>
-    <w:bookmarkStart w:id="40" w:name="ref-dohertyTestingLifeHistory2004"/>
+    <w:bookmarkEnd w:id="39"/>
+    <w:bookmarkStart w:id="41" w:name="ref-dohertyTestingLifeHistory2004"/>
     <w:p>
       <w:pPr>
         <w:pStyle w:val="Bibliography"/>
@@ -2308,7 +2356,7 @@
       <w:r>
         <w:t xml:space="preserve"> </w:t>
       </w:r>
-      <w:hyperlink r:id="rId39">
+      <w:hyperlink r:id="rId40">
         <w:r>
           <w:rPr>
             <w:rStyle w:val="Hyperlink"/>
@@ -2317,8 +2365,8 @@
         </w:r>
       </w:hyperlink>
     </w:p>
-    <w:bookmarkEnd w:id="40"/>
-    <w:bookmarkStart w:id="42" w:name="ref-durantRegimeShiftsBreeding2004"/>
+    <w:bookmarkEnd w:id="41"/>
+    <w:bookmarkStart w:id="43" w:name="ref-durantRegimeShiftsBreeding2004"/>
     <w:p>
       <w:pPr>
         <w:pStyle w:val="Bibliography"/>
@@ -2367,7 +2415,7 @@
       <w:r>
         <w:t xml:space="preserve"> </w:t>
       </w:r>
-      <w:hyperlink r:id="rId41">
+      <w:hyperlink r:id="rId42">
         <w:r>
           <w:rPr>
             <w:rStyle w:val="Hyperlink"/>
@@ -2376,8 +2424,8 @@
         </w:r>
       </w:hyperlink>
     </w:p>
-    <w:bookmarkEnd w:id="42"/>
-    <w:bookmarkStart w:id="43" w:name="ref-fayetLocalPreyShortages2021"/>
+    <w:bookmarkEnd w:id="43"/>
+    <w:bookmarkStart w:id="44" w:name="ref-fayetLocalPreyShortages2021"/>
     <w:p>
       <w:pPr>
         <w:pStyle w:val="Bibliography"/>
@@ -2424,8 +2472,8 @@
         <w:t xml:space="preserve">, 1152–1164.</w:t>
       </w:r>
     </w:p>
-    <w:bookmarkEnd w:id="43"/>
-    <w:bookmarkStart w:id="45" w:name="X402cb5e1a4e69ff49497d0188bad825f79b15d6"/>
+    <w:bookmarkEnd w:id="44"/>
+    <w:bookmarkStart w:id="46" w:name="X402cb5e1a4e69ff49497d0188bad825f79b15d6"/>
     <w:p>
       <w:pPr>
         <w:pStyle w:val="Bibliography"/>
@@ -2471,7 +2519,7 @@
       <w:r>
         <w:t xml:space="preserve"> </w:t>
       </w:r>
-      <w:hyperlink r:id="rId44">
+      <w:hyperlink r:id="rId45">
         <w:r>
           <w:rPr>
             <w:rStyle w:val="Hyperlink"/>
@@ -2480,8 +2528,8 @@
         </w:r>
       </w:hyperlink>
     </w:p>
-    <w:bookmarkEnd w:id="45"/>
-    <w:bookmarkStart w:id="47" w:name="X33c5e51ec6e1feb638e31c81b30fec3bad61a46"/>
+    <w:bookmarkEnd w:id="46"/>
+    <w:bookmarkStart w:id="48" w:name="X33c5e51ec6e1feb638e31c81b30fec3bad61a46"/>
     <w:p>
       <w:pPr>
         <w:pStyle w:val="Bibliography"/>
@@ -2518,7 +2566,7 @@
       <w:r>
         <w:t xml:space="preserve"> </w:t>
       </w:r>
-      <w:hyperlink r:id="rId46">
+      <w:hyperlink r:id="rId47">
         <w:r>
           <w:rPr>
             <w:rStyle w:val="Hyperlink"/>
@@ -2527,8 +2575,8 @@
         </w:r>
       </w:hyperlink>
     </w:p>
-    <w:bookmarkEnd w:id="47"/>
-    <w:bookmarkStart w:id="48" w:name="Xd2c1001e50c6a03f5980b48bf021065e127b4b3"/>
+    <w:bookmarkEnd w:id="48"/>
+    <w:bookmarkStart w:id="49" w:name="Xd2c1001e50c6a03f5980b48bf021065e127b4b3"/>
     <w:p>
       <w:pPr>
         <w:pStyle w:val="Bibliography"/>
@@ -2609,8 +2657,8 @@
         <w:t xml:space="preserve">(p. 177). Fróðskapur, Faroe University Press.</w:t>
       </w:r>
     </w:p>
-    <w:bookmarkEnd w:id="48"/>
-    <w:bookmarkStart w:id="50" w:name="X686eab3f81361263a84b2098b98864d463c743b"/>
+    <w:bookmarkEnd w:id="49"/>
+    <w:bookmarkStart w:id="51" w:name="X686eab3f81361263a84b2098b98864d463c743b"/>
     <w:p>
       <w:pPr>
         <w:pStyle w:val="Bibliography"/>
@@ -2647,7 +2695,7 @@
       <w:r>
         <w:t xml:space="preserve"> </w:t>
       </w:r>
-      <w:hyperlink r:id="rId49">
+      <w:hyperlink r:id="rId50">
         <w:r>
           <w:rPr>
             <w:rStyle w:val="Hyperlink"/>
@@ -2656,8 +2704,8 @@
         </w:r>
       </w:hyperlink>
     </w:p>
-    <w:bookmarkEnd w:id="50"/>
-    <w:bookmarkStart w:id="51" w:name="ref-jensenPuffinFowlingaFowling2010"/>
+    <w:bookmarkEnd w:id="51"/>
+    <w:bookmarkStart w:id="52" w:name="ref-jensenPuffinFowlingaFowling2010"/>
     <w:p>
       <w:pPr>
         <w:pStyle w:val="Bibliography"/>
@@ -2714,8 +2762,8 @@
         <w:t xml:space="preserve">. Føroya Skúlabókagrunnur.</w:t>
       </w:r>
     </w:p>
-    <w:bookmarkEnd w:id="51"/>
-    <w:bookmarkStart w:id="52" w:name="ref-jensenListBirdsSeen2005"/>
+    <w:bookmarkEnd w:id="52"/>
+    <w:bookmarkStart w:id="53" w:name="ref-jensenListBirdsSeen2005"/>
     <w:p>
       <w:pPr>
         <w:pStyle w:val="Bibliography"/>
@@ -2774,8 +2822,8 @@
         <w:t xml:space="preserve">. Føroya Náttúrugripasavn, Tórshavn, Faroe Islands.</w:t>
       </w:r>
     </w:p>
-    <w:bookmarkEnd w:id="52"/>
-    <w:bookmarkStart w:id="53" w:name="ref-jensenTraditionsPuffinFowling2020"/>
+    <w:bookmarkEnd w:id="53"/>
+    <w:bookmarkStart w:id="54" w:name="ref-jensenTraditionsPuffinFowling2020"/>
     <w:p>
       <w:pPr>
         <w:pStyle w:val="Bibliography"/>
@@ -2822,8 +2870,8 @@
         <w:t xml:space="preserve">, 3–17.</w:t>
       </w:r>
     </w:p>
-    <w:bookmarkEnd w:id="53"/>
-    <w:bookmarkStart w:id="55" w:name="X289cc0e6e2d6f2de639c6553ec3bb635a7ae663"/>
+    <w:bookmarkEnd w:id="54"/>
+    <w:bookmarkStart w:id="56" w:name="X289cc0e6e2d6f2de639c6553ec3bb635a7ae663"/>
     <w:p>
       <w:pPr>
         <w:pStyle w:val="Bibliography"/>
@@ -2872,7 +2920,7 @@
       <w:r>
         <w:t xml:space="preserve"> </w:t>
       </w:r>
-      <w:hyperlink r:id="rId54">
+      <w:hyperlink r:id="rId55">
         <w:r>
           <w:rPr>
             <w:rStyle w:val="Hyperlink"/>
@@ -2881,8 +2929,8 @@
         </w:r>
       </w:hyperlink>
     </w:p>
-    <w:bookmarkEnd w:id="55"/>
-    <w:bookmarkStart w:id="57" w:name="ref-johnson2024icelandic"/>
+    <w:bookmarkEnd w:id="56"/>
+    <w:bookmarkStart w:id="58" w:name="ref-johnson2024icelandic"/>
     <w:p>
       <w:pPr>
         <w:pStyle w:val="Bibliography"/>
@@ -2906,7 +2954,7 @@
       <w:r>
         <w:t xml:space="preserve"> </w:t>
       </w:r>
-      <w:hyperlink r:id="rId56">
+      <w:hyperlink r:id="rId57">
         <w:r>
           <w:rPr>
             <w:rStyle w:val="Hyperlink"/>
@@ -2915,8 +2963,8 @@
         </w:r>
       </w:hyperlink>
     </w:p>
-    <w:bookmarkEnd w:id="57"/>
-    <w:bookmarkStart w:id="59" w:name="ref-jonesIncubationPatchBirds1971"/>
+    <w:bookmarkEnd w:id="58"/>
+    <w:bookmarkStart w:id="60" w:name="ref-jonesIncubationPatchBirds1971"/>
     <w:p>
       <w:pPr>
         <w:pStyle w:val="Bibliography"/>
@@ -2974,7 +3022,7 @@
       <w:r>
         <w:t xml:space="preserve"> </w:t>
       </w:r>
-      <w:hyperlink r:id="rId58">
+      <w:hyperlink r:id="rId59">
         <w:r>
           <w:rPr>
             <w:rStyle w:val="Hyperlink"/>
@@ -2983,8 +3031,8 @@
         </w:r>
       </w:hyperlink>
     </w:p>
-    <w:bookmarkEnd w:id="59"/>
-    <w:bookmarkStart w:id="60" w:name="Xe19625febeb906ccdb6e58cd53cb47af33dcf28"/>
+    <w:bookmarkEnd w:id="60"/>
+    <w:bookmarkStart w:id="61" w:name="Xe19625febeb906ccdb6e58cd53cb47af33dcf28"/>
     <w:p>
       <w:pPr>
         <w:pStyle w:val="Bibliography"/>
@@ -2993,8 +3041,8 @@
         <w:t xml:space="preserve">Løgtingslóg Um Fuglaveiðu, Sum Seinast Broytt Við Løgtingslóg Nr. 70 Frá 22. Mai 2023 (1984).</w:t>
       </w:r>
     </w:p>
-    <w:bookmarkEnd w:id="60"/>
-    <w:bookmarkStart w:id="62" w:name="ref-lowtherAtlanticPuffinFratercula2020"/>
+    <w:bookmarkEnd w:id="61"/>
+    <w:bookmarkStart w:id="63" w:name="ref-lowtherAtlanticPuffinFratercula2020"/>
     <w:p>
       <w:pPr>
         <w:pStyle w:val="Bibliography"/>
@@ -3027,7 +3075,7 @@
       <w:r>
         <w:t xml:space="preserve"> </w:t>
       </w:r>
-      <w:hyperlink r:id="rId61">
+      <w:hyperlink r:id="rId62">
         <w:r>
           <w:rPr>
             <w:rStyle w:val="Hyperlink"/>
@@ -3036,8 +3084,8 @@
         </w:r>
       </w:hyperlink>
     </w:p>
-    <w:bookmarkEnd w:id="62"/>
-    <w:bookmarkStart w:id="64" w:name="X207bec76f29f8d8311150c8279e9cc679159524"/>
+    <w:bookmarkEnd w:id="63"/>
+    <w:bookmarkStart w:id="65" w:name="X207bec76f29f8d8311150c8279e9cc679159524"/>
     <w:p>
       <w:pPr>
         <w:pStyle w:val="Bibliography"/>
@@ -3137,7 +3185,7 @@
       <w:r>
         <w:t xml:space="preserve"> </w:t>
       </w:r>
-      <w:hyperlink r:id="rId63">
+      <w:hyperlink r:id="rId64">
         <w:r>
           <w:rPr>
             <w:rStyle w:val="Hyperlink"/>
@@ -3146,8 +3194,8 @@
         </w:r>
       </w:hyperlink>
     </w:p>
-    <w:bookmarkEnd w:id="64"/>
-    <w:bookmarkStart w:id="66" w:name="X958f21470482a6a06ce614515743210bd9f3c46"/>
+    <w:bookmarkEnd w:id="65"/>
+    <w:bookmarkStart w:id="67" w:name="X958f21470482a6a06ce614515743210bd9f3c46"/>
     <w:p>
       <w:pPr>
         <w:pStyle w:val="Bibliography"/>
@@ -3250,7 +3298,7 @@
       <w:r>
         <w:t xml:space="preserve"> </w:t>
       </w:r>
-      <w:hyperlink r:id="rId65">
+      <w:hyperlink r:id="rId66">
         <w:r>
           <w:rPr>
             <w:rStyle w:val="Hyperlink"/>
@@ -3259,8 +3307,8 @@
         </w:r>
       </w:hyperlink>
     </w:p>
-    <w:bookmarkEnd w:id="66"/>
-    <w:bookmarkStart w:id="68" w:name="ref-milesDeclineAtlanticPuffin2015"/>
+    <w:bookmarkEnd w:id="67"/>
+    <w:bookmarkStart w:id="69" w:name="ref-milesDeclineAtlanticPuffin2015"/>
     <w:p>
       <w:pPr>
         <w:pStyle w:val="Bibliography"/>
@@ -3339,7 +3387,7 @@
       <w:r>
         <w:t xml:space="preserve"> </w:t>
       </w:r>
-      <w:hyperlink r:id="rId67">
+      <w:hyperlink r:id="rId68">
         <w:r>
           <w:rPr>
             <w:rStyle w:val="Hyperlink"/>
@@ -3348,13 +3396,84 @@
         </w:r>
       </w:hyperlink>
     </w:p>
-    <w:bookmarkEnd w:id="68"/>
-    <w:bookmarkStart w:id="69" w:name="ref-sandvikHighSurvivalImmatures2008"/>
+    <w:bookmarkEnd w:id="69"/>
+    <w:bookmarkStart w:id="71" w:name="ref-naturescot2026guga"/>
     <w:p>
       <w:pPr>
         <w:pStyle w:val="Bibliography"/>
       </w:pPr>
       <w:r>
+        <w:t xml:space="preserve">NatureScot. (2026).</w:t>
+      </w:r>
+      <w:r>
+        <w:t xml:space="preserve"> </w:t>
+      </w:r>
+      <w:r>
+        <w:rPr>
+          <w:i/>
+          <w:iCs/>
+        </w:rPr>
+        <w:t xml:space="preserve">Latest guga hunt statement</w:t>
+      </w:r>
+      <w:r>
+        <w:t xml:space="preserve">. Retrieved August 4, 2026, from</w:t>
+      </w:r>
+      <w:r>
+        <w:t xml:space="preserve"> </w:t>
+      </w:r>
+      <w:hyperlink r:id="rId70">
+        <w:r>
+          <w:rPr>
+            <w:rStyle w:val="Hyperlink"/>
+          </w:rPr>
+          <w:t xml:space="preserve">https://www.nature.scot/latest-guga-hunt-statement</w:t>
+        </w:r>
+      </w:hyperlink>
+    </w:p>
+    <w:bookmarkEnd w:id="71"/>
+    <w:bookmarkStart w:id="73" w:name="X03b217116af5a405b2e157107e6b8a2cfe31837"/>
+    <w:p>
+      <w:pPr>
+        <w:pStyle w:val="Bibliography"/>
+      </w:pPr>
+      <w:r>
+        <w:t xml:space="preserve">R Core Team. (2026).</w:t>
+      </w:r>
+      <w:r>
+        <w:t xml:space="preserve"> </w:t>
+      </w:r>
+      <w:r>
+        <w:rPr>
+          <w:i/>
+          <w:iCs/>
+        </w:rPr>
+        <w:t xml:space="preserve">R: A language and environment for statistical computing</w:t>
+      </w:r>
+      <w:r>
+        <w:t xml:space="preserve"> </w:t>
+      </w:r>
+      <w:r>
+        <w:t xml:space="preserve">[Manual]. R Foundation for Statistical Computing.</w:t>
+      </w:r>
+      <w:r>
+        <w:t xml:space="preserve"> </w:t>
+      </w:r>
+      <w:hyperlink r:id="rId72">
+        <w:r>
+          <w:rPr>
+            <w:rStyle w:val="Hyperlink"/>
+          </w:rPr>
+          <w:t xml:space="preserve">https://doi.org/10.32614/R.manuals</w:t>
+        </w:r>
+      </w:hyperlink>
+    </w:p>
+    <w:bookmarkEnd w:id="73"/>
+    <w:bookmarkStart w:id="74" w:name="ref-sandvikHighSurvivalImmatures2008"/>
+    <w:p>
+      <w:pPr>
+        <w:pStyle w:val="Bibliography"/>
+      </w:pPr>
+      <w:r>
         <w:t xml:space="preserve">Sandvik, H., Erikstad, K. E., Fauchald, P., &amp; Tveraa, T. (2008). High survival of immatures in a long-lived seabird: Insights from a long-term study of the</w:t>
       </w:r>
       <w:r>
@@ -3405,8 +3524,8 @@
         <w:t xml:space="preserve">, 723–730.</w:t>
       </w:r>
     </w:p>
-    <w:bookmarkEnd w:id="69"/>
-    <w:bookmarkStart w:id="71" w:name="X3ede5c96a343fbec70bed9a420846eae3dca84b"/>
+    <w:bookmarkEnd w:id="74"/>
+    <w:bookmarkStart w:id="76" w:name="X3ede5c96a343fbec70bed9a420846eae3dca84b"/>
     <w:p>
       <w:pPr>
         <w:pStyle w:val="Bibliography"/>
@@ -3443,7 +3562,7 @@
       <w:r>
         <w:t xml:space="preserve"> </w:t>
       </w:r>
-      <w:hyperlink r:id="rId70">
+      <w:hyperlink r:id="rId75">
         <w:r>
           <w:rPr>
             <w:rStyle w:val="Hyperlink"/>
@@ -3452,8 +3571,8 @@
         </w:r>
       </w:hyperlink>
     </w:p>
-    <w:bookmarkEnd w:id="71"/>
-    <w:bookmarkStart w:id="73" w:name="ref-vanfraneker2004"/>
+    <w:bookmarkEnd w:id="76"/>
+    <w:bookmarkStart w:id="78" w:name="ref-vanfraneker2004"/>
     <w:p>
       <w:pPr>
         <w:pStyle w:val="Bibliography"/>
@@ -3508,7 +3627,7 @@
       <w:r>
         <w:t xml:space="preserve"> </w:t>
       </w:r>
-      <w:hyperlink r:id="rId72">
+      <w:hyperlink r:id="rId77">
         <w:r>
           <w:rPr>
             <w:rStyle w:val="Hyperlink"/>
@@ -3517,8 +3636,8 @@
         </w:r>
       </w:hyperlink>
     </w:p>
-    <w:bookmarkEnd w:id="73"/>
-    <w:bookmarkStart w:id="75" w:name="ref-vehtariPracticalBayesianModel2017"/>
+    <w:bookmarkEnd w:id="78"/>
+    <w:bookmarkStart w:id="80" w:name="ref-vehtariPracticalBayesianModel2017"/>
     <w:p>
       <w:pPr>
         <w:pStyle w:val="Bibliography"/>
@@ -3576,7 +3695,7 @@
       <w:r>
         <w:t xml:space="preserve"> </w:t>
       </w:r>
-      <w:hyperlink r:id="rId74">
+      <w:hyperlink r:id="rId79">
         <w:r>
           <w:rPr>
             <w:rStyle w:val="Hyperlink"/>
@@ -3585,8 +3704,8 @@
         </w:r>
       </w:hyperlink>
     </w:p>
-    <w:bookmarkEnd w:id="75"/>
-    <w:bookmarkStart w:id="77" w:name="Xb381b5d8d6d3401bbb0133a1c086c6f6782b533"/>
+    <w:bookmarkEnd w:id="80"/>
+    <w:bookmarkStart w:id="82" w:name="Xb381b5d8d6d3401bbb0133a1c086c6f6782b533"/>
     <w:p>
       <w:pPr>
         <w:pStyle w:val="Bibliography"/>
@@ -3692,7 +3811,7 @@
       <w:r>
         <w:t xml:space="preserve"> </w:t>
       </w:r>
-      <w:hyperlink r:id="rId76">
+      <w:hyperlink r:id="rId81">
         <w:r>
           <w:rPr>
             <w:rStyle w:val="Hyperlink"/>
@@ -3701,8 +3820,8 @@
         </w:r>
       </w:hyperlink>
     </w:p>
-    <w:bookmarkEnd w:id="77"/>
-    <w:bookmarkStart w:id="78" w:name="ref-vehtariParetoSmoothedImportance2024"/>
+    <w:bookmarkEnd w:id="82"/>
+    <w:bookmarkStart w:id="83" w:name="ref-vehtariParetoSmoothedImportance2024"/>
     <w:p>
       <w:pPr>
         <w:pStyle w:val="Bibliography"/>
@@ -3737,8 +3856,8 @@
         <w:t xml:space="preserve">(72), 1–58.</w:t>
       </w:r>
     </w:p>
-    <w:bookmarkEnd w:id="78"/>
-    <w:bookmarkEnd w:id="79"/>
+    <w:bookmarkEnd w:id="83"/>
+    <w:bookmarkEnd w:id="84"/>
     <w:p>
       <w:r>
         <w:br w:type="page"/>
@@ -3824,117 +3943,24 @@
       <w:tr>
         <w:tc>
           <w:tcPr/>
-          <w:bookmarkStart w:id="84" w:name="fig-map"/>
+          <w:bookmarkStart w:id="89" w:name="fig-map"/>
           <w:p>
             <w:pPr>
               <w:pStyle w:val="Compact"/>
               <w:jc w:val="center"/>
             </w:pPr>
-            <w:bookmarkStart w:id="83" w:name="fig-map"/>
+            <w:bookmarkStart w:id="88" w:name="fig-map"/>
             <w:r>
               <w:drawing>
                 <wp:inline>
                   <wp:extent cx="5943600" cy="6028508"/>
-                  <wp:effectExtent b="0" l="0" r="0" t="0"/>
-                  <wp:docPr descr="" title="" id="81" name="Picture"/>
-                  <a:graphic>
-                    <a:graphicData uri="http://schemas.openxmlformats.org/drawingml/2006/picture">
-                      <pic:pic>
-                        <pic:nvPicPr>
-                          <pic:cNvPr descr="manuscript_files/figure-docx/fig-map-1.png" id="82" name="Picture"/>
-                          <pic:cNvPicPr>
-                            <a:picLocks noChangeArrowheads="1" noChangeAspect="1"/>
-                          </pic:cNvPicPr>
-                        </pic:nvPicPr>
-                        <pic:blipFill>
-                          <a:blip r:embed="rId80"/>
-                          <a:stretch>
-                            <a:fillRect/>
-                          </a:stretch>
-                        </pic:blipFill>
-                        <pic:spPr bwMode="auto">
-                          <a:xfrm>
-                            <a:off x="0" y="0"/>
-                            <a:ext cx="5943600" cy="6028508"/>
-                          </a:xfrm>
-                          <a:prstGeom prst="rect">
-                            <a:avLst/>
-                          </a:prstGeom>
-                          <a:noFill/>
-                          <a:ln w="9525">
-                            <a:noFill/>
-                            <a:headEnd/>
-                            <a:tailEnd/>
-                          </a:ln>
-                        </pic:spPr>
-                      </pic:pic>
-                    </a:graphicData>
-                  </a:graphic>
-                </wp:inline>
-              </w:drawing>
-            </w:r>
-            <w:bookmarkEnd w:id="83"/>
-          </w:p>
-          <w:p>
-            <w:pPr>
-              <w:jc w:val="center"/>
-            </w:pPr>
-            <w:pPr>
-              <w:jc w:val="left"/>
-              <w:spacing w:before="200"/>
-              <w:pStyle w:val="ImageCaption"/>
-            </w:pPr>
-            <w:r>
-              <w:rPr>
-                <w:b/>
-                <w:bCs/>
-              </w:rPr>
-              <w:t xml:space="preserve">Fig.</w:t>
-            </w:r>
-            <w:r>
-              <w:t xml:space="preserve"> 1</w:t>
-            </w:r>
-          </w:p>
-          <w:bookmarkEnd w:id="84"/>
-        </w:tc>
-      </w:tr>
-    </w:tbl>
-    <w:p>
-      <w:r>
-        <w:br w:type="page"/>
-      </w:r>
-    </w:p>
-    <w:tbl>
-      <w:tblPr>
-        <w:tblStyle w:val="Table"/>
-        <w:tblW w:type="pct" w:w="5000"/>
-        <w:tblLayout w:type="fixed"/>
-        <w:tblLook w:firstRow="0" w:lastRow="0" w:firstColumn="0" w:lastColumn="0" w:noHBand="0" w:noVBand="0" w:val="0000"/>
-      </w:tblPr>
-      <w:tblGrid>
-        <w:gridCol w:w="7920"/>
-      </w:tblGrid>
-      <w:tr>
-        <w:tc>
-          <w:tcPr/>
-          <w:bookmarkStart w:id="89" w:name="fig-marg-bar"/>
-          <w:p>
-            <w:pPr>
-              <w:pStyle w:val="Compact"/>
-              <w:jc w:val="center"/>
-            </w:pPr>
-            <w:bookmarkStart w:id="88" w:name="fig-marg-bar"/>
-            <w:r>
-              <w:drawing>
-                <wp:inline>
-                  <wp:extent cx="5943600" cy="4245428"/>
                   <wp:effectExtent b="0" l="0" r="0" t="0"/>
                   <wp:docPr descr="" title="" id="86" name="Picture"/>
                   <a:graphic>
                     <a:graphicData uri="http://schemas.openxmlformats.org/drawingml/2006/picture">
                       <pic:pic>
                         <pic:nvPicPr>
-                          <pic:cNvPr descr="manuscript_files/figure-docx/fig-marg-bar-1.png" id="87" name="Picture"/>
+                          <pic:cNvPr descr="manuscript_files/figure-docx/fig-map-1.png" id="87" name="Picture"/>
                           <pic:cNvPicPr>
                             <a:picLocks noChangeArrowheads="1" noChangeAspect="1"/>
                           </pic:cNvPicPr>
@@ -3948,7 +3974,7 @@
                         <pic:spPr bwMode="auto">
                           <a:xfrm>
                             <a:off x="0" y="0"/>
-                            <a:ext cx="5943600" cy="4245428"/>
+                            <a:ext cx="5943600" cy="6028508"/>
                           </a:xfrm>
                           <a:prstGeom prst="rect">
                             <a:avLst/>
@@ -3985,7 +4011,7 @@
               <w:t xml:space="preserve">Fig.</w:t>
             </w:r>
             <w:r>
-              <w:t xml:space="preserve"> 2</w:t>
+              <w:t xml:space="preserve"> 1</w:t>
             </w:r>
           </w:p>
           <w:bookmarkEnd w:id="89"/>
@@ -4010,13 +4036,13 @@
       <w:tr>
         <w:tc>
           <w:tcPr/>
-          <w:bookmarkStart w:id="94" w:name="fig-pred1"/>
+          <w:bookmarkStart w:id="94" w:name="fig-marg-bar"/>
           <w:p>
             <w:pPr>
               <w:pStyle w:val="Compact"/>
               <w:jc w:val="center"/>
             </w:pPr>
-            <w:bookmarkStart w:id="93" w:name="fig-pred1"/>
+            <w:bookmarkStart w:id="93" w:name="fig-marg-bar"/>
             <w:r>
               <w:drawing>
                 <wp:inline>
@@ -4027,7 +4053,7 @@
                     <a:graphicData uri="http://schemas.openxmlformats.org/drawingml/2006/picture">
                       <pic:pic>
                         <pic:nvPicPr>
-                          <pic:cNvPr descr="manuscript_files/figure-docx/fig-pred1-1.png" id="92" name="Picture"/>
+                          <pic:cNvPr descr="manuscript_files/figure-docx/fig-marg-bar-1.png" id="92" name="Picture"/>
                           <pic:cNvPicPr>
                             <a:picLocks noChangeArrowheads="1" noChangeAspect="1"/>
                           </pic:cNvPicPr>
@@ -4078,7 +4104,7 @@
               <w:t xml:space="preserve">Fig.</w:t>
             </w:r>
             <w:r>
-              <w:t xml:space="preserve"> 3</w:t>
+              <w:t xml:space="preserve"> 2</w:t>
             </w:r>
           </w:p>
           <w:bookmarkEnd w:id="94"/>
@@ -4103,13 +4129,13 @@
       <w:tr>
         <w:tc>
           <w:tcPr/>
-          <w:bookmarkStart w:id="99" w:name="fig-pred2"/>
+          <w:bookmarkStart w:id="99" w:name="fig-pred1"/>
           <w:p>
             <w:pPr>
               <w:pStyle w:val="Compact"/>
               <w:jc w:val="center"/>
             </w:pPr>
-            <w:bookmarkStart w:id="98" w:name="fig-pred2"/>
+            <w:bookmarkStart w:id="98" w:name="fig-pred1"/>
             <w:r>
               <w:drawing>
                 <wp:inline>
@@ -4120,7 +4146,7 @@
                     <a:graphicData uri="http://schemas.openxmlformats.org/drawingml/2006/picture">
                       <pic:pic>
                         <pic:nvPicPr>
-                          <pic:cNvPr descr="manuscript_files/figure-docx/fig-pred2-1.png" id="97" name="Picture"/>
+                          <pic:cNvPr descr="manuscript_files/figure-docx/fig-pred1-1.png" id="97" name="Picture"/>
                           <pic:cNvPicPr>
                             <a:picLocks noChangeArrowheads="1" noChangeAspect="1"/>
                           </pic:cNvPicPr>
@@ -4171,7 +4197,7 @@
               <w:t xml:space="preserve">Fig.</w:t>
             </w:r>
             <w:r>
-              <w:t xml:space="preserve"> 4</w:t>
+              <w:t xml:space="preserve"> 3</w:t>
             </w:r>
           </w:p>
           <w:bookmarkEnd w:id="99"/>
@@ -4196,7 +4222,100 @@
       <w:tr>
         <w:tc>
           <w:tcPr/>
-          <w:bookmarkStart w:id="100" w:name="tbl-harvest"/>
+          <w:bookmarkStart w:id="104" w:name="fig-pred2"/>
+          <w:p>
+            <w:pPr>
+              <w:pStyle w:val="Compact"/>
+              <w:jc w:val="center"/>
+            </w:pPr>
+            <w:bookmarkStart w:id="103" w:name="fig-pred2"/>
+            <w:r>
+              <w:drawing>
+                <wp:inline>
+                  <wp:extent cx="5943600" cy="4245428"/>
+                  <wp:effectExtent b="0" l="0" r="0" t="0"/>
+                  <wp:docPr descr="" title="" id="101" name="Picture"/>
+                  <a:graphic>
+                    <a:graphicData uri="http://schemas.openxmlformats.org/drawingml/2006/picture">
+                      <pic:pic>
+                        <pic:nvPicPr>
+                          <pic:cNvPr descr="manuscript_files/figure-docx/fig-pred2-1.png" id="102" name="Picture"/>
+                          <pic:cNvPicPr>
+                            <a:picLocks noChangeArrowheads="1" noChangeAspect="1"/>
+                          </pic:cNvPicPr>
+                        </pic:nvPicPr>
+                        <pic:blipFill>
+                          <a:blip r:embed="rId100"/>
+                          <a:stretch>
+                            <a:fillRect/>
+                          </a:stretch>
+                        </pic:blipFill>
+                        <pic:spPr bwMode="auto">
+                          <a:xfrm>
+                            <a:off x="0" y="0"/>
+                            <a:ext cx="5943600" cy="4245428"/>
+                          </a:xfrm>
+                          <a:prstGeom prst="rect">
+                            <a:avLst/>
+                          </a:prstGeom>
+                          <a:noFill/>
+                          <a:ln w="9525">
+                            <a:noFill/>
+                            <a:headEnd/>
+                            <a:tailEnd/>
+                          </a:ln>
+                        </pic:spPr>
+                      </pic:pic>
+                    </a:graphicData>
+                  </a:graphic>
+                </wp:inline>
+              </w:drawing>
+            </w:r>
+            <w:bookmarkEnd w:id="103"/>
+          </w:p>
+          <w:p>
+            <w:pPr>
+              <w:jc w:val="center"/>
+            </w:pPr>
+            <w:pPr>
+              <w:jc w:val="left"/>
+              <w:spacing w:before="200"/>
+              <w:pStyle w:val="ImageCaption"/>
+            </w:pPr>
+            <w:r>
+              <w:rPr>
+                <w:b/>
+                <w:bCs/>
+              </w:rPr>
+              <w:t xml:space="preserve">Fig.</w:t>
+            </w:r>
+            <w:r>
+              <w:t xml:space="preserve"> 4</w:t>
+            </w:r>
+          </w:p>
+          <w:bookmarkEnd w:id="104"/>
+        </w:tc>
+      </w:tr>
+    </w:tbl>
+    <w:p>
+      <w:r>
+        <w:br w:type="page"/>
+      </w:r>
+    </w:p>
+    <w:tbl>
+      <w:tblPr>
+        <w:tblStyle w:val="Table"/>
+        <w:tblW w:type="pct" w:w="5000"/>
+        <w:tblLayout w:type="fixed"/>
+        <w:tblLook w:firstRow="0" w:lastRow="0" w:firstColumn="0" w:lastColumn="0" w:noHBand="0" w:noVBand="0" w:val="0000"/>
+      </w:tblPr>
+      <w:tblGrid>
+        <w:gridCol w:w="7920"/>
+      </w:tblGrid>
+      <w:tr>
+        <w:tc>
+          <w:tcPr/>
+          <w:bookmarkStart w:id="105" w:name="tbl-harvest"/>
           <w:p>
             <w:pPr>
               <w:jc w:val="center"/>
@@ -5634,7 +5753,7 @@
               </w:tc>
             </w:tr>
           </w:tbl>
-          <w:bookmarkEnd w:id="100"/>
+          <w:bookmarkEnd w:id="105"/>
           <w:p/>
         </w:tc>
       </w:tr>
@@ -5657,7 +5776,7 @@
       <w:tr>
         <w:tc>
           <w:tcPr/>
-          <w:bookmarkStart w:id="101" w:name="tbl-odds1"/>
+          <w:bookmarkStart w:id="106" w:name="tbl-odds1"/>
           <w:p>
             <w:pPr>
               <w:jc w:val="center"/>
@@ -5962,12 +6081,12 @@
               </w:tc>
             </w:tr>
           </w:tbl>
-          <w:bookmarkEnd w:id="101"/>
+          <w:bookmarkEnd w:id="106"/>
           <w:p/>
         </w:tc>
       </w:tr>
     </w:tbl>
-    <w:bookmarkEnd w:id="102"/>
+    <w:bookmarkEnd w:id="107"/>
     <w:sectPr>
       <w:type w:val="continuous"/>
       <w:pgSz w:h="15840" w:w="12240"/>

</xml_diff>

<commit_message>
Add v1.1.0 Zenodo DOI to manuscript and references
Co-Authored-By: Claude Opus 5.5 <noreply@anthropic.com>
</commit_message>
<xml_diff>
--- a/manuscript/manuscript.docx
+++ b/manuscript/manuscript.docx
@@ -1858,7 +1858,7 @@
           <w:rPr>
             <w:rStyle w:val="Hyperlink"/>
           </w:rPr>
-          <w:t xml:space="preserve">https://doi.org/10.5281/zenodo.21780561</w:t>
+          <w:t xml:space="preserve">https://doi.org/10.5281/zenodo.23393736</w:t>
         </w:r>
       </w:hyperlink>
       <w:r>
@@ -1872,7 +1872,7 @@
       </w:r>
     </w:p>
     <w:bookmarkEnd w:id="19"/>
-    <w:bookmarkStart w:id="118" w:name="references"/>
+    <w:bookmarkStart w:id="117" w:name="references"/>
     <w:p>
       <w:pPr>
         <w:pStyle w:val="Heading1"/>
@@ -1881,7 +1881,7 @@
         <w:t xml:space="preserve">REFERENCES</w:t>
       </w:r>
     </w:p>
-    <w:bookmarkStart w:id="95" w:name="refs"/>
+    <w:bookmarkStart w:id="94" w:name="refs"/>
     <w:bookmarkStart w:id="21" w:name="ref-ashcroftSurvivalRatesBreeding1979"/>
     <w:p>
       <w:pPr>
@@ -2030,7 +2030,7 @@
       </w:hyperlink>
     </w:p>
     <w:bookmarkEnd w:id="23"/>
-    <w:bookmarkStart w:id="25" w:name="X5001aa68545cec2af7068c5799e4bc0a6cad2bc"/>
+    <w:bookmarkStart w:id="24" w:name="X5001aa68545cec2af7068c5799e4bc0a6cad2bc"/>
     <w:p>
       <w:pPr>
         <w:pStyle w:val="Bibliography"/>
@@ -2046,7 +2046,28 @@
           <w:i/>
           <w:iCs/>
         </w:rPr>
-        <w:t xml:space="preserve">Puffin_female_harvest: Code and data for ’</w:t>
+        <w:t xml:space="preserve">puffin_female_harvest</w:t>
+      </w:r>
+      <w:r>
+        <w:rPr>
+          <w:i/>
+          <w:iCs/>
+        </w:rPr>
+        <w:t xml:space="preserve">: Code and data for</w:t>
+      </w:r>
+      <w:r>
+        <w:rPr>
+          <w:i/>
+          <w:iCs/>
+        </w:rPr>
+        <w:t xml:space="preserve"> </w:t>
+      </w:r>
+      <w:r>
+        <w:rPr>
+          <w:i/>
+          <w:iCs/>
+        </w:rPr>
+        <w:t xml:space="preserve">“</w:t>
       </w:r>
       <w:r>
         <w:rPr>
@@ -2074,42 +2095,37 @@
           <w:i/>
           <w:iCs/>
         </w:rPr>
-        <w:t xml:space="preserve">Atlantic</w:t>
-      </w:r>
-      <w:r>
-        <w:rPr>
-          <w:i/>
-          <w:iCs/>
-        </w:rPr>
-        <w:t xml:space="preserve"> </w:t>
-      </w:r>
-      <w:r>
-        <w:rPr>
-          <w:i/>
-          <w:iCs/>
-        </w:rPr>
-        <w:t xml:space="preserve">puffins (</w:t>
-      </w:r>
-      <w:r>
-        <w:rPr>
-          <w:i/>
-          <w:iCs/>
-        </w:rPr>
-        <w:t xml:space="preserve">Fratercula</w:t>
-      </w:r>
-      <w:r>
-        <w:rPr>
-          <w:i/>
-          <w:iCs/>
-        </w:rPr>
-        <w:t xml:space="preserve"> </w:t>
-      </w:r>
-      <w:r>
-        <w:rPr>
-          <w:i/>
-          <w:iCs/>
-        </w:rPr>
-        <w:t xml:space="preserve">arctica) are disappearing from</w:t>
+        <w:t xml:space="preserve">Atlantic Puffins</w:t>
+      </w:r>
+      <w:r>
+        <w:rPr>
+          <w:i/>
+          <w:iCs/>
+        </w:rPr>
+        <w:t xml:space="preserve"> </w:t>
+      </w:r>
+      <w:r>
+        <w:rPr>
+          <w:i/>
+          <w:i/>
+          <w:iCs/>
+          <w:iCs/>
+        </w:rPr>
+        <w:t xml:space="preserve">Fratercula arctica</w:t>
+      </w:r>
+      <w:r>
+        <w:rPr>
+          <w:i/>
+          <w:iCs/>
+        </w:rPr>
+        <w:t xml:space="preserve"> </w:t>
+      </w:r>
+      <w:r>
+        <w:rPr>
+          <w:i/>
+          <w:iCs/>
+        </w:rPr>
+        <w:t xml:space="preserve">are disappearing from</w:t>
       </w:r>
       <w:r>
         <w:rPr>
@@ -2137,28 +2153,28 @@
           <w:i/>
           <w:iCs/>
         </w:rPr>
-        <w:t xml:space="preserve">colonies’</w:t>
-      </w:r>
-      <w:r>
-        <w:t xml:space="preserve"> </w:t>
-      </w:r>
-      <w:r>
-        <w:t xml:space="preserve">(Version v1.0.0) [Dataset]. Zenodo.</w:t>
-      </w:r>
-      <w:r>
-        <w:t xml:space="preserve"> </w:t>
-      </w:r>
-      <w:hyperlink r:id="rId24">
+        <w:t xml:space="preserve">colonies”</w:t>
+      </w:r>
+      <w:r>
+        <w:t xml:space="preserve"> </w:t>
+      </w:r>
+      <w:r>
+        <w:t xml:space="preserve">(Version v1.1.0) [Dataset]. Zenodo.</w:t>
+      </w:r>
+      <w:r>
+        <w:t xml:space="preserve"> </w:t>
+      </w:r>
+      <w:hyperlink r:id="rId18">
         <w:r>
           <w:rPr>
             <w:rStyle w:val="Hyperlink"/>
           </w:rPr>
-          <w:t xml:space="preserve">https://doi.org/10.5281/ZENODO.21780561</w:t>
+          <w:t xml:space="preserve">https://doi.org/10.5281/zenodo.23393736</w:t>
         </w:r>
       </w:hyperlink>
     </w:p>
-    <w:bookmarkEnd w:id="25"/>
-    <w:bookmarkStart w:id="27" w:name="ref-baileyIncubationPatchPasserine1952"/>
+    <w:bookmarkEnd w:id="24"/>
+    <w:bookmarkStart w:id="26" w:name="ref-baileyIncubationPatchPasserine1952"/>
     <w:p>
       <w:pPr>
         <w:pStyle w:val="Bibliography"/>
@@ -2195,7 +2211,7 @@
       <w:r>
         <w:t xml:space="preserve"> </w:t>
       </w:r>
-      <w:hyperlink r:id="rId26">
+      <w:hyperlink r:id="rId25">
         <w:r>
           <w:rPr>
             <w:rStyle w:val="Hyperlink"/>
@@ -2204,8 +2220,8 @@
         </w:r>
       </w:hyperlink>
     </w:p>
-    <w:bookmarkEnd w:id="27"/>
-    <w:bookmarkStart w:id="29" w:name="X6fe9fda70bed21ba65d61585bcf1d825af477bf"/>
+    <w:bookmarkEnd w:id="26"/>
+    <w:bookmarkStart w:id="28" w:name="X6fe9fda70bed21ba65d61585bcf1d825af477bf"/>
     <w:p>
       <w:pPr>
         <w:pStyle w:val="Bibliography"/>
@@ -2280,7 +2296,7 @@
       <w:r>
         <w:t xml:space="preserve"> </w:t>
       </w:r>
-      <w:hyperlink r:id="rId28">
+      <w:hyperlink r:id="rId27">
         <w:r>
           <w:rPr>
             <w:rStyle w:val="Hyperlink"/>
@@ -2289,8 +2305,8 @@
         </w:r>
       </w:hyperlink>
     </w:p>
-    <w:bookmarkEnd w:id="29"/>
-    <w:bookmarkStart w:id="31" w:name="X2251d75557b56d22c3e2c47990efce73593f512"/>
+    <w:bookmarkEnd w:id="28"/>
+    <w:bookmarkStart w:id="30" w:name="X2251d75557b56d22c3e2c47990efce73593f512"/>
     <w:p>
       <w:pPr>
         <w:pStyle w:val="Bibliography"/>
@@ -2330,7 +2346,7 @@
       <w:r>
         <w:t xml:space="preserve"> </w:t>
       </w:r>
-      <w:hyperlink r:id="rId30">
+      <w:hyperlink r:id="rId29">
         <w:r>
           <w:rPr>
             <w:rStyle w:val="Hyperlink"/>
@@ -2339,8 +2355,8 @@
         </w:r>
       </w:hyperlink>
     </w:p>
-    <w:bookmarkEnd w:id="31"/>
-    <w:bookmarkStart w:id="33" w:name="ref-burknerBrmsPackageBayesian2017"/>
+    <w:bookmarkEnd w:id="30"/>
+    <w:bookmarkStart w:id="32" w:name="ref-burknerBrmsPackageBayesian2017"/>
     <w:p>
       <w:pPr>
         <w:pStyle w:val="Bibliography"/>
@@ -2419,7 +2435,7 @@
       <w:r>
         <w:t xml:space="preserve"> </w:t>
       </w:r>
-      <w:hyperlink r:id="rId32">
+      <w:hyperlink r:id="rId31">
         <w:r>
           <w:rPr>
             <w:rStyle w:val="Hyperlink"/>
@@ -2428,8 +2444,8 @@
         </w:r>
       </w:hyperlink>
     </w:p>
-    <w:bookmarkEnd w:id="33"/>
-    <w:bookmarkStart w:id="35" w:name="ref-burrLaterHigherLatitudes2016"/>
+    <w:bookmarkEnd w:id="32"/>
+    <w:bookmarkStart w:id="34" w:name="ref-burrLaterHigherLatitudes2016"/>
     <w:p>
       <w:pPr>
         <w:pStyle w:val="Bibliography"/>
@@ -2466,7 +2482,7 @@
       <w:r>
         <w:t xml:space="preserve"> </w:t>
       </w:r>
-      <w:hyperlink r:id="rId34">
+      <w:hyperlink r:id="rId33">
         <w:r>
           <w:rPr>
             <w:rStyle w:val="Hyperlink"/>
@@ -2475,8 +2491,8 @@
         </w:r>
       </w:hyperlink>
     </w:p>
-    <w:bookmarkEnd w:id="35"/>
-    <w:bookmarkStart w:id="37" w:name="ref-clairbauxNorthAtlanticWinter2021"/>
+    <w:bookmarkEnd w:id="34"/>
+    <w:bookmarkStart w:id="36" w:name="ref-clairbauxNorthAtlanticWinter2021"/>
     <w:p>
       <w:pPr>
         <w:pStyle w:val="Bibliography"/>
@@ -2525,7 +2541,7 @@
       <w:r>
         <w:t xml:space="preserve"> </w:t>
       </w:r>
-      <w:hyperlink r:id="rId36">
+      <w:hyperlink r:id="rId35">
         <w:r>
           <w:rPr>
             <w:rStyle w:val="Hyperlink"/>
@@ -2534,8 +2550,8 @@
         </w:r>
       </w:hyperlink>
     </w:p>
-    <w:bookmarkEnd w:id="37"/>
-    <w:bookmarkStart w:id="39" w:name="ref-diasThreatsSeabirdsGlobal2019"/>
+    <w:bookmarkEnd w:id="36"/>
+    <w:bookmarkStart w:id="38" w:name="ref-diasThreatsSeabirdsGlobal2019"/>
     <w:p>
       <w:pPr>
         <w:pStyle w:val="Bibliography"/>
@@ -2584,7 +2600,7 @@
       <w:r>
         <w:t xml:space="preserve"> </w:t>
       </w:r>
-      <w:hyperlink r:id="rId38">
+      <w:hyperlink r:id="rId37">
         <w:r>
           <w:rPr>
             <w:rStyle w:val="Hyperlink"/>
@@ -2593,8 +2609,8 @@
         </w:r>
       </w:hyperlink>
     </w:p>
-    <w:bookmarkEnd w:id="39"/>
-    <w:bookmarkStart w:id="41" w:name="ref-dohertyTestingLifeHistory2004"/>
+    <w:bookmarkEnd w:id="38"/>
+    <w:bookmarkStart w:id="40" w:name="ref-dohertyTestingLifeHistory2004"/>
     <w:p>
       <w:pPr>
         <w:pStyle w:val="Bibliography"/>
@@ -2631,7 +2647,7 @@
       <w:r>
         <w:t xml:space="preserve"> </w:t>
       </w:r>
-      <w:hyperlink r:id="rId40">
+      <w:hyperlink r:id="rId39">
         <w:r>
           <w:rPr>
             <w:rStyle w:val="Hyperlink"/>
@@ -2640,8 +2656,8 @@
         </w:r>
       </w:hyperlink>
     </w:p>
-    <w:bookmarkEnd w:id="41"/>
-    <w:bookmarkStart w:id="43" w:name="ref-durantRegimeShiftsBreeding2004"/>
+    <w:bookmarkEnd w:id="40"/>
+    <w:bookmarkStart w:id="42" w:name="ref-durantRegimeShiftsBreeding2004"/>
     <w:p>
       <w:pPr>
         <w:pStyle w:val="Bibliography"/>
@@ -2690,7 +2706,7 @@
       <w:r>
         <w:t xml:space="preserve"> </w:t>
       </w:r>
-      <w:hyperlink r:id="rId42">
+      <w:hyperlink r:id="rId41">
         <w:r>
           <w:rPr>
             <w:rStyle w:val="Hyperlink"/>
@@ -2699,8 +2715,8 @@
         </w:r>
       </w:hyperlink>
     </w:p>
-    <w:bookmarkEnd w:id="43"/>
-    <w:bookmarkStart w:id="45" w:name="ref-fayetLocalPreyShortages2021"/>
+    <w:bookmarkEnd w:id="42"/>
+    <w:bookmarkStart w:id="44" w:name="ref-fayetLocalPreyShortages2021"/>
     <w:p>
       <w:pPr>
         <w:pStyle w:val="Bibliography"/>
@@ -2749,7 +2765,7 @@
       <w:r>
         <w:t xml:space="preserve"> </w:t>
       </w:r>
-      <w:hyperlink r:id="rId44">
+      <w:hyperlink r:id="rId43">
         <w:r>
           <w:rPr>
             <w:rStyle w:val="Hyperlink"/>
@@ -2758,8 +2774,8 @@
         </w:r>
       </w:hyperlink>
     </w:p>
-    <w:bookmarkEnd w:id="45"/>
-    <w:bookmarkStart w:id="47" w:name="X402cb5e1a4e69ff49497d0188bad825f79b15d6"/>
+    <w:bookmarkEnd w:id="44"/>
+    <w:bookmarkStart w:id="46" w:name="X402cb5e1a4e69ff49497d0188bad825f79b15d6"/>
     <w:p>
       <w:pPr>
         <w:pStyle w:val="Bibliography"/>
@@ -2808,7 +2824,7 @@
       <w:r>
         <w:t xml:space="preserve"> </w:t>
       </w:r>
-      <w:hyperlink r:id="rId46">
+      <w:hyperlink r:id="rId45">
         <w:r>
           <w:rPr>
             <w:rStyle w:val="Hyperlink"/>
@@ -2817,8 +2833,8 @@
         </w:r>
       </w:hyperlink>
     </w:p>
-    <w:bookmarkEnd w:id="47"/>
-    <w:bookmarkStart w:id="49" w:name="X33c5e51ec6e1feb638e31c81b30fec3bad61a46"/>
+    <w:bookmarkEnd w:id="46"/>
+    <w:bookmarkStart w:id="48" w:name="X33c5e51ec6e1feb638e31c81b30fec3bad61a46"/>
     <w:p>
       <w:pPr>
         <w:pStyle w:val="Bibliography"/>
@@ -2855,7 +2871,7 @@
       <w:r>
         <w:t xml:space="preserve"> </w:t>
       </w:r>
-      <w:hyperlink r:id="rId48">
+      <w:hyperlink r:id="rId47">
         <w:r>
           <w:rPr>
             <w:rStyle w:val="Hyperlink"/>
@@ -2864,95 +2880,95 @@
         </w:r>
       </w:hyperlink>
     </w:p>
+    <w:bookmarkEnd w:id="48"/>
+    <w:bookmarkStart w:id="49" w:name="Xd2c1001e50c6a03f5980b48bf021065e127b4b3"/>
+    <w:p>
+      <w:pPr>
+        <w:pStyle w:val="Bibliography"/>
+      </w:pPr>
+      <w:r>
+        <w:t xml:space="preserve">Hammer, S., Madsen, J., Jensen, J.-K., Pedersen, K., &amp; Bloch, D. (2014).</w:t>
+      </w:r>
+      <w:r>
+        <w:t xml:space="preserve"> </w:t>
+      </w:r>
+      <w:r>
+        <w:rPr>
+          <w:i/>
+          <w:iCs/>
+        </w:rPr>
+        <w:t xml:space="preserve">Færøsk</w:t>
+      </w:r>
+      <w:r>
+        <w:rPr>
+          <w:i/>
+          <w:iCs/>
+        </w:rPr>
+        <w:t xml:space="preserve"> </w:t>
+      </w:r>
+      <w:r>
+        <w:rPr>
+          <w:i/>
+          <w:iCs/>
+        </w:rPr>
+        <w:t xml:space="preserve">Trækfugleatlas</w:t>
+      </w:r>
+      <w:r>
+        <w:rPr>
+          <w:i/>
+          <w:iCs/>
+        </w:rPr>
+        <w:t xml:space="preserve"> </w:t>
+      </w:r>
+      <w:r>
+        <w:rPr>
+          <w:i/>
+          <w:iCs/>
+        </w:rPr>
+        <w:t xml:space="preserve">– the</w:t>
+      </w:r>
+      <w:r>
+        <w:rPr>
+          <w:i/>
+          <w:iCs/>
+        </w:rPr>
+        <w:t xml:space="preserve"> </w:t>
+      </w:r>
+      <w:r>
+        <w:rPr>
+          <w:i/>
+          <w:iCs/>
+        </w:rPr>
+        <w:t xml:space="preserve">Faroese</w:t>
+      </w:r>
+      <w:r>
+        <w:rPr>
+          <w:i/>
+          <w:iCs/>
+        </w:rPr>
+        <w:t xml:space="preserve"> </w:t>
+      </w:r>
+      <w:r>
+        <w:rPr>
+          <w:i/>
+          <w:iCs/>
+        </w:rPr>
+        <w:t xml:space="preserve">bird migration atlas</w:t>
+      </w:r>
+      <w:r>
+        <w:t xml:space="preserve"> </w:t>
+      </w:r>
+      <w:r>
+        <w:t xml:space="preserve">(p. 177). Fróðskapur, Faroe University Press.</w:t>
+      </w:r>
+    </w:p>
     <w:bookmarkEnd w:id="49"/>
-    <w:bookmarkStart w:id="50" w:name="Xd2c1001e50c6a03f5980b48bf021065e127b4b3"/>
+    <w:bookmarkStart w:id="51" w:name="X686eab3f81361263a84b2098b98864d463c743b"/>
     <w:p>
       <w:pPr>
         <w:pStyle w:val="Bibliography"/>
       </w:pPr>
       <w:r>
-        <w:t xml:space="preserve">Hammer, S., Madsen, J., Jensen, J.-K., Pedersen, K., &amp; Bloch, D. (2014).</w:t>
-      </w:r>
-      <w:r>
-        <w:t xml:space="preserve"> </w:t>
-      </w:r>
-      <w:r>
-        <w:rPr>
-          <w:i/>
-          <w:iCs/>
-        </w:rPr>
-        <w:t xml:space="preserve">Færøsk</w:t>
-      </w:r>
-      <w:r>
-        <w:rPr>
-          <w:i/>
-          <w:iCs/>
-        </w:rPr>
-        <w:t xml:space="preserve"> </w:t>
-      </w:r>
-      <w:r>
-        <w:rPr>
-          <w:i/>
-          <w:iCs/>
-        </w:rPr>
-        <w:t xml:space="preserve">Trækfugleatlas</w:t>
-      </w:r>
-      <w:r>
-        <w:rPr>
-          <w:i/>
-          <w:iCs/>
-        </w:rPr>
-        <w:t xml:space="preserve"> </w:t>
-      </w:r>
-      <w:r>
-        <w:rPr>
-          <w:i/>
-          <w:iCs/>
-        </w:rPr>
-        <w:t xml:space="preserve">– the</w:t>
-      </w:r>
-      <w:r>
-        <w:rPr>
-          <w:i/>
-          <w:iCs/>
-        </w:rPr>
-        <w:t xml:space="preserve"> </w:t>
-      </w:r>
-      <w:r>
-        <w:rPr>
-          <w:i/>
-          <w:iCs/>
-        </w:rPr>
-        <w:t xml:space="preserve">Faroese</w:t>
-      </w:r>
-      <w:r>
-        <w:rPr>
-          <w:i/>
-          <w:iCs/>
-        </w:rPr>
-        <w:t xml:space="preserve"> </w:t>
-      </w:r>
-      <w:r>
-        <w:rPr>
-          <w:i/>
-          <w:iCs/>
-        </w:rPr>
-        <w:t xml:space="preserve">bird migration atlas</w:t>
-      </w:r>
-      <w:r>
-        <w:t xml:space="preserve"> </w:t>
-      </w:r>
-      <w:r>
-        <w:t xml:space="preserve">(p. 177). Fróðskapur, Faroe University Press.</w:t>
-      </w:r>
-    </w:p>
-    <w:bookmarkEnd w:id="50"/>
-    <w:bookmarkStart w:id="52" w:name="X686eab3f81361263a84b2098b98864d463c743b"/>
-    <w:p>
-      <w:pPr>
-        <w:pStyle w:val="Bibliography"/>
-      </w:pPr>
-      <w:r>
         <w:t xml:space="preserve">Jenouvrier, S., Barbraud, C., Cazelles, B., &amp; Weimerskirch, H. (2005). Modelling population dynamics of seabirds: Importance of the effects of climate fluctuations on breeding proportions.</w:t>
       </w:r>
       <w:r>
@@ -2984,7 +3000,7 @@
       <w:r>
         <w:t xml:space="preserve"> </w:t>
       </w:r>
-      <w:hyperlink r:id="rId51">
+      <w:hyperlink r:id="rId50">
         <w:r>
           <w:rPr>
             <w:rStyle w:val="Hyperlink"/>
@@ -2993,8 +3009,8 @@
         </w:r>
       </w:hyperlink>
     </w:p>
-    <w:bookmarkEnd w:id="52"/>
-    <w:bookmarkStart w:id="54" w:name="ref-jensenBreedingSeason2021"/>
+    <w:bookmarkEnd w:id="51"/>
+    <w:bookmarkStart w:id="53" w:name="ref-jensenBreedingSeason2021"/>
     <w:p>
       <w:pPr>
         <w:pStyle w:val="Bibliography"/>
@@ -3074,7 +3090,7 @@
       <w:r>
         <w:t xml:space="preserve"> </w:t>
       </w:r>
-      <w:hyperlink r:id="rId53">
+      <w:hyperlink r:id="rId52">
         <w:r>
           <w:rPr>
             <w:rStyle w:val="Hyperlink"/>
@@ -3083,154 +3099,202 @@
         </w:r>
       </w:hyperlink>
     </w:p>
+    <w:bookmarkEnd w:id="53"/>
+    <w:bookmarkStart w:id="54" w:name="ref-jensenPuffinFowlingaFowling2010"/>
+    <w:p>
+      <w:pPr>
+        <w:pStyle w:val="Bibliography"/>
+      </w:pPr>
+      <w:r>
+        <w:t xml:space="preserve">Jensen, J.-K. (2010).</w:t>
+      </w:r>
+      <w:r>
+        <w:t xml:space="preserve"> </w:t>
+      </w:r>
+      <w:r>
+        <w:rPr>
+          <w:i/>
+          <w:iCs/>
+        </w:rPr>
+        <w:t xml:space="preserve">Puffin fowling-a fowling day on</w:t>
+      </w:r>
+      <w:r>
+        <w:rPr>
+          <w:i/>
+          <w:iCs/>
+        </w:rPr>
+        <w:t xml:space="preserve"> </w:t>
+      </w:r>
+      <w:r>
+        <w:rPr>
+          <w:i/>
+          <w:iCs/>
+        </w:rPr>
+        <w:t xml:space="preserve">Nólsoy</w:t>
+      </w:r>
+      <w:r>
+        <w:rPr>
+          <w:i/>
+          <w:iCs/>
+        </w:rPr>
+        <w:t xml:space="preserve">,</w:t>
+      </w:r>
+      <w:r>
+        <w:rPr>
+          <w:i/>
+          <w:iCs/>
+        </w:rPr>
+        <w:t xml:space="preserve"> </w:t>
+      </w:r>
+      <w:r>
+        <w:rPr>
+          <w:i/>
+          <w:iCs/>
+        </w:rPr>
+        <w:t xml:space="preserve">Faroe Islands</w:t>
+      </w:r>
+      <w:r>
+        <w:t xml:space="preserve">. Føroya Skúlabókagrunnur.</w:t>
+      </w:r>
+    </w:p>
     <w:bookmarkEnd w:id="54"/>
-    <w:bookmarkStart w:id="55" w:name="ref-jensenPuffinFowlingaFowling2010"/>
+    <w:bookmarkStart w:id="55" w:name="ref-jensenListBirdsSeen2005"/>
     <w:p>
       <w:pPr>
         <w:pStyle w:val="Bibliography"/>
       </w:pPr>
       <w:r>
-        <w:t xml:space="preserve">Jensen, J.-K. (2010).</w:t>
-      </w:r>
-      <w:r>
-        <w:t xml:space="preserve"> </w:t>
-      </w:r>
-      <w:r>
-        <w:rPr>
-          <w:i/>
-          <w:iCs/>
-        </w:rPr>
-        <w:t xml:space="preserve">Puffin fowling-a fowling day on</w:t>
-      </w:r>
-      <w:r>
-        <w:rPr>
-          <w:i/>
-          <w:iCs/>
-        </w:rPr>
-        <w:t xml:space="preserve"> </w:t>
-      </w:r>
-      <w:r>
-        <w:rPr>
-          <w:i/>
-          <w:iCs/>
-        </w:rPr>
-        <w:t xml:space="preserve">Nólsoy</w:t>
-      </w:r>
-      <w:r>
-        <w:rPr>
-          <w:i/>
-          <w:iCs/>
-        </w:rPr>
+        <w:t xml:space="preserve">Jensen, J.-K., Bloch, D., &amp; Olsen, B. (2005). List of birds seen in the</w:t>
+      </w:r>
+      <w:r>
+        <w:t xml:space="preserve"> </w:t>
+      </w:r>
+      <w:r>
+        <w:t xml:space="preserve">Faroe Islands</w:t>
+      </w:r>
+      <w:r>
+        <w:t xml:space="preserve">. In</w:t>
+      </w:r>
+      <w:r>
+        <w:t xml:space="preserve"> </w:t>
+      </w:r>
+      <w:r>
+        <w:rPr>
+          <w:i/>
+          <w:iCs/>
+        </w:rPr>
+        <w:t xml:space="preserve">Føroya fuglafrøðifelag and</w:t>
+      </w:r>
+      <w:r>
+        <w:rPr>
+          <w:i/>
+          <w:iCs/>
+        </w:rPr>
+        <w:t xml:space="preserve"> </w:t>
+      </w:r>
+      <w:r>
+        <w:rPr>
+          <w:i/>
+          <w:iCs/>
+        </w:rPr>
+        <w:t xml:space="preserve">Føroya</w:t>
+      </w:r>
+      <w:r>
+        <w:rPr>
+          <w:i/>
+          <w:iCs/>
+        </w:rPr>
+        <w:t xml:space="preserve"> </w:t>
+      </w:r>
+      <w:r>
+        <w:rPr>
+          <w:i/>
+          <w:iCs/>
+        </w:rPr>
+        <w:t xml:space="preserve">skúlabókagrunnur</w:t>
+      </w:r>
+      <w:r>
+        <w:t xml:space="preserve">. Føroya Náttúrugripasavn, Tórshavn, Faroe Islands.</w:t>
+      </w:r>
+    </w:p>
+    <w:bookmarkEnd w:id="55"/>
+    <w:bookmarkStart w:id="56" w:name="ref-jensenTraditionsPuffinFowling2020"/>
+    <w:p>
+      <w:pPr>
+        <w:pStyle w:val="Bibliography"/>
+      </w:pPr>
+      <w:r>
+        <w:t xml:space="preserve">Jensen, J.-K., &amp; Olsen, B. (2020). Traditions for puffin fowling in the</w:t>
+      </w:r>
+      <w:r>
+        <w:t xml:space="preserve"> </w:t>
+      </w:r>
+      <w:r>
+        <w:t xml:space="preserve">Faroe Islands</w:t>
+      </w:r>
+      <w:r>
+        <w:t xml:space="preserve"> </w:t>
+      </w:r>
+      <w:r>
+        <w:t xml:space="preserve">the last decades.</w:t>
+      </w:r>
+      <w:r>
+        <w:t xml:space="preserve"> </w:t>
+      </w:r>
+      <w:r>
+        <w:rPr>
+          <w:i/>
+          <w:iCs/>
+        </w:rPr>
+        <w:t xml:space="preserve">Journal of Nature Faroe Islands</w:t>
+      </w:r>
+      <w:r>
         <w:t xml:space="preserve">,</w:t>
       </w:r>
       <w:r>
-        <w:rPr>
-          <w:i/>
-          <w:iCs/>
-        </w:rPr>
-        <w:t xml:space="preserve"> </w:t>
-      </w:r>
-      <w:r>
-        <w:rPr>
-          <w:i/>
-          <w:iCs/>
-        </w:rPr>
-        <w:t xml:space="preserve">Faroe Islands</w:t>
-      </w:r>
-      <w:r>
-        <w:t xml:space="preserve">. Føroya Skúlabókagrunnur.</w:t>
-      </w:r>
-    </w:p>
-    <w:bookmarkEnd w:id="55"/>
-    <w:bookmarkStart w:id="56" w:name="ref-jensenListBirdsSeen2005"/>
+        <w:t xml:space="preserve"> </w:t>
+      </w:r>
+      <w:r>
+        <w:rPr>
+          <w:i/>
+          <w:iCs/>
+        </w:rPr>
+        <w:t xml:space="preserve">1</w:t>
+      </w:r>
+      <w:r>
+        <w:t xml:space="preserve">, 3–17.</w:t>
+      </w:r>
+    </w:p>
+    <w:bookmarkEnd w:id="56"/>
+    <w:bookmarkStart w:id="58" w:name="X289cc0e6e2d6f2de639c6553ec3bb635a7ae663"/>
     <w:p>
       <w:pPr>
         <w:pStyle w:val="Bibliography"/>
       </w:pPr>
       <w:r>
-        <w:t xml:space="preserve">Jensen, J.-K., Bloch, D., &amp; Olsen, B. (2005). List of birds seen in the</w:t>
-      </w:r>
-      <w:r>
-        <w:t xml:space="preserve"> </w:t>
-      </w:r>
-      <w:r>
-        <w:t xml:space="preserve">Faroe Islands</w:t>
-      </w:r>
-      <w:r>
-        <w:t xml:space="preserve">. In</w:t>
-      </w:r>
-      <w:r>
-        <w:t xml:space="preserve"> </w:t>
-      </w:r>
-      <w:r>
-        <w:rPr>
-          <w:i/>
-          <w:iCs/>
-        </w:rPr>
-        <w:t xml:space="preserve">Føroya fuglafrøðifelag and</w:t>
-      </w:r>
-      <w:r>
-        <w:rPr>
-          <w:i/>
-          <w:iCs/>
-        </w:rPr>
-        <w:t xml:space="preserve"> </w:t>
-      </w:r>
-      <w:r>
-        <w:rPr>
-          <w:i/>
-          <w:iCs/>
-        </w:rPr>
-        <w:t xml:space="preserve">Føroya</w:t>
-      </w:r>
-      <w:r>
-        <w:rPr>
-          <w:i/>
-          <w:iCs/>
-        </w:rPr>
-        <w:t xml:space="preserve"> </w:t>
-      </w:r>
-      <w:r>
-        <w:rPr>
-          <w:i/>
-          <w:iCs/>
-        </w:rPr>
-        <w:t xml:space="preserve">skúlabókagrunnur</w:t>
-      </w:r>
-      <w:r>
-        <w:t xml:space="preserve">. Føroya Náttúrugripasavn, Tórshavn, Faroe Islands.</w:t>
-      </w:r>
-    </w:p>
-    <w:bookmarkEnd w:id="56"/>
-    <w:bookmarkStart w:id="57" w:name="ref-jensenTraditionsPuffinFowling2020"/>
-    <w:p>
-      <w:pPr>
-        <w:pStyle w:val="Bibliography"/>
-      </w:pPr>
-      <w:r>
-        <w:t xml:space="preserve">Jensen, J.-K., &amp; Olsen, B. (2020). Traditions for puffin fowling in the</w:t>
-      </w:r>
-      <w:r>
-        <w:t xml:space="preserve"> </w:t>
-      </w:r>
-      <w:r>
-        <w:t xml:space="preserve">Faroe Islands</w:t>
-      </w:r>
-      <w:r>
-        <w:t xml:space="preserve"> </w:t>
-      </w:r>
-      <w:r>
-        <w:t xml:space="preserve">the last decades.</w:t>
-      </w:r>
-      <w:r>
-        <w:t xml:space="preserve"> </w:t>
-      </w:r>
-      <w:r>
-        <w:rPr>
-          <w:i/>
-          <w:iCs/>
-        </w:rPr>
-        <w:t xml:space="preserve">Journal of Nature Faroe Islands</w:t>
+        <w:t xml:space="preserve">Johnson, F. A., &amp; Nielsen, Ó. K. (2024). Regional demography of</w:t>
+      </w:r>
+      <w:r>
+        <w:t xml:space="preserve"> </w:t>
+      </w:r>
+      <w:r>
+        <w:t xml:space="preserve">Icelandic</w:t>
+      </w:r>
+      <w:r>
+        <w:t xml:space="preserve"> </w:t>
+      </w:r>
+      <w:r>
+        <w:t xml:space="preserve">rock ptarmigan and its implications for harvest management.</w:t>
+      </w:r>
+      <w:r>
+        <w:t xml:space="preserve"> </w:t>
+      </w:r>
+      <w:r>
+        <w:rPr>
+          <w:i/>
+          <w:iCs/>
+        </w:rPr>
+        <w:t xml:space="preserve">Ecological Solutions and Evidence</w:t>
       </w:r>
       <w:r>
         <w:t xml:space="preserve">,</w:t>
@@ -3243,54 +3307,6 @@
           <w:i/>
           <w:iCs/>
         </w:rPr>
-        <w:t xml:space="preserve">1</w:t>
-      </w:r>
-      <w:r>
-        <w:t xml:space="preserve">, 3–17.</w:t>
-      </w:r>
-    </w:p>
-    <w:bookmarkEnd w:id="57"/>
-    <w:bookmarkStart w:id="59" w:name="X289cc0e6e2d6f2de639c6553ec3bb635a7ae663"/>
-    <w:p>
-      <w:pPr>
-        <w:pStyle w:val="Bibliography"/>
-      </w:pPr>
-      <w:r>
-        <w:t xml:space="preserve">Johnson, F. A., &amp; Nielsen, Ó. K. (2024). Regional demography of</w:t>
-      </w:r>
-      <w:r>
-        <w:t xml:space="preserve"> </w:t>
-      </w:r>
-      <w:r>
-        <w:t xml:space="preserve">Icelandic</w:t>
-      </w:r>
-      <w:r>
-        <w:t xml:space="preserve"> </w:t>
-      </w:r>
-      <w:r>
-        <w:t xml:space="preserve">rock ptarmigan and its implications for harvest management.</w:t>
-      </w:r>
-      <w:r>
-        <w:t xml:space="preserve"> </w:t>
-      </w:r>
-      <w:r>
-        <w:rPr>
-          <w:i/>
-          <w:iCs/>
-        </w:rPr>
-        <w:t xml:space="preserve">Ecological Solutions and Evidence</w:t>
-      </w:r>
-      <w:r>
-        <w:t xml:space="preserve">,</w:t>
-      </w:r>
-      <w:r>
-        <w:t xml:space="preserve"> </w:t>
-      </w:r>
-      <w:r>
-        <w:rPr>
-          <w:i/>
-          <w:iCs/>
-        </w:rPr>
         <w:t xml:space="preserve">5</w:t>
       </w:r>
       <w:r>
@@ -3299,7 +3315,7 @@
       <w:r>
         <w:t xml:space="preserve"> </w:t>
       </w:r>
-      <w:hyperlink r:id="rId58">
+      <w:hyperlink r:id="rId57">
         <w:r>
           <w:rPr>
             <w:rStyle w:val="Hyperlink"/>
@@ -3308,8 +3324,8 @@
         </w:r>
       </w:hyperlink>
     </w:p>
-    <w:bookmarkEnd w:id="59"/>
-    <w:bookmarkStart w:id="61" w:name="ref-johnson2024icelandic"/>
+    <w:bookmarkEnd w:id="58"/>
+    <w:bookmarkStart w:id="60" w:name="ref-johnson2024icelandic"/>
     <w:p>
       <w:pPr>
         <w:pStyle w:val="Bibliography"/>
@@ -3333,7 +3349,7 @@
       <w:r>
         <w:t xml:space="preserve"> </w:t>
       </w:r>
-      <w:hyperlink r:id="rId60">
+      <w:hyperlink r:id="rId59">
         <w:r>
           <w:rPr>
             <w:rStyle w:val="Hyperlink"/>
@@ -3342,8 +3358,8 @@
         </w:r>
       </w:hyperlink>
     </w:p>
-    <w:bookmarkEnd w:id="61"/>
-    <w:bookmarkStart w:id="63" w:name="ref-jonesIncubationPatchBirds1971"/>
+    <w:bookmarkEnd w:id="60"/>
+    <w:bookmarkStart w:id="62" w:name="ref-jonesIncubationPatchBirds1971"/>
     <w:p>
       <w:pPr>
         <w:pStyle w:val="Bibliography"/>
@@ -3380,7 +3396,7 @@
       <w:r>
         <w:t xml:space="preserve"> </w:t>
       </w:r>
-      <w:hyperlink r:id="rId62">
+      <w:hyperlink r:id="rId61">
         <w:r>
           <w:rPr>
             <w:rStyle w:val="Hyperlink"/>
@@ -3389,23 +3405,23 @@
         </w:r>
       </w:hyperlink>
     </w:p>
+    <w:bookmarkEnd w:id="62"/>
+    <w:bookmarkStart w:id="63" w:name="Xe19625febeb906ccdb6e58cd53cb47af33dcf28"/>
+    <w:p>
+      <w:pPr>
+        <w:pStyle w:val="Bibliography"/>
+      </w:pPr>
+      <w:r>
+        <w:t xml:space="preserve">Løgtingslóg um fuglaveiðu, sum seinast broytt við løgtingslóg nr. 70 frá 22. mai 2023 (1984).</w:t>
+      </w:r>
+    </w:p>
     <w:bookmarkEnd w:id="63"/>
-    <w:bookmarkStart w:id="64" w:name="Xe19625febeb906ccdb6e58cd53cb47af33dcf28"/>
+    <w:bookmarkStart w:id="65" w:name="ref-lowtherAtlanticPuffinFratercula2020"/>
     <w:p>
       <w:pPr>
         <w:pStyle w:val="Bibliography"/>
       </w:pPr>
       <w:r>
-        <w:t xml:space="preserve">Løgtingslóg um fuglaveiðu, sum seinast broytt við løgtingslóg nr. 70 frá 22. mai 2023 (1984).</w:t>
-      </w:r>
-    </w:p>
-    <w:bookmarkEnd w:id="64"/>
-    <w:bookmarkStart w:id="66" w:name="ref-lowtherAtlanticPuffinFratercula2020"/>
-    <w:p>
-      <w:pPr>
-        <w:pStyle w:val="Bibliography"/>
-      </w:pPr>
-      <w:r>
         <w:t xml:space="preserve">Lowther, P. E., Diamond, A. W., Kress, S. W., Robertson, G. J., Russell, K., Nettleship, D. N., Kirwan, G. M., Christie, D. A., Sharpe, C. J., Garcia, E. F. J., &amp; Boesman, P. F. D. (2020). Atlantic puffin (</w:t>
       </w:r>
       <w:r>
@@ -3434,7 +3450,7 @@
       <w:r>
         <w:t xml:space="preserve"> </w:t>
       </w:r>
-      <w:hyperlink r:id="rId65">
+      <w:hyperlink r:id="rId64">
         <w:r>
           <w:rPr>
             <w:rStyle w:val="Hyperlink"/>
@@ -3443,8 +3459,8 @@
         </w:r>
       </w:hyperlink>
     </w:p>
-    <w:bookmarkEnd w:id="66"/>
-    <w:bookmarkStart w:id="68" w:name="X207bec76f29f8d8311150c8279e9cc679159524"/>
+    <w:bookmarkEnd w:id="65"/>
+    <w:bookmarkStart w:id="67" w:name="X207bec76f29f8d8311150c8279e9cc679159524"/>
     <w:p>
       <w:pPr>
         <w:pStyle w:val="Bibliography"/>
@@ -3546,7 +3562,7 @@
       <w:r>
         <w:t xml:space="preserve"> </w:t>
       </w:r>
-      <w:hyperlink r:id="rId67">
+      <w:hyperlink r:id="rId66">
         <w:r>
           <w:rPr>
             <w:rStyle w:val="Hyperlink"/>
@@ -3555,8 +3571,8 @@
         </w:r>
       </w:hyperlink>
     </w:p>
-    <w:bookmarkEnd w:id="68"/>
-    <w:bookmarkStart w:id="70" w:name="X958f21470482a6a06ce614515743210bd9f3c46"/>
+    <w:bookmarkEnd w:id="67"/>
+    <w:bookmarkStart w:id="69" w:name="X958f21470482a6a06ce614515743210bd9f3c46"/>
     <w:p>
       <w:pPr>
         <w:pStyle w:val="Bibliography"/>
@@ -3614,7 +3630,7 @@
       <w:r>
         <w:t xml:space="preserve"> </w:t>
       </w:r>
-      <w:hyperlink r:id="rId69">
+      <w:hyperlink r:id="rId68">
         <w:r>
           <w:rPr>
             <w:rStyle w:val="Hyperlink"/>
@@ -3623,8 +3639,8 @@
         </w:r>
       </w:hyperlink>
     </w:p>
-    <w:bookmarkEnd w:id="70"/>
-    <w:bookmarkStart w:id="72" w:name="ref-milesDeclineAtlanticPuffin2015"/>
+    <w:bookmarkEnd w:id="69"/>
+    <w:bookmarkStart w:id="71" w:name="ref-milesDeclineAtlanticPuffin2015"/>
     <w:p>
       <w:pPr>
         <w:pStyle w:val="Bibliography"/>
@@ -3685,7 +3701,7 @@
       <w:r>
         <w:t xml:space="preserve"> </w:t>
       </w:r>
-      <w:hyperlink r:id="rId71">
+      <w:hyperlink r:id="rId70">
         <w:r>
           <w:rPr>
             <w:rStyle w:val="Hyperlink"/>
@@ -3694,8 +3710,8 @@
         </w:r>
       </w:hyperlink>
     </w:p>
-    <w:bookmarkEnd w:id="72"/>
-    <w:bookmarkStart w:id="74" w:name="ref-naturescot2026guga"/>
+    <w:bookmarkEnd w:id="71"/>
+    <w:bookmarkStart w:id="73" w:name="ref-naturescot2026guga"/>
     <w:p>
       <w:pPr>
         <w:pStyle w:val="Bibliography"/>
@@ -3719,7 +3735,7 @@
       <w:r>
         <w:t xml:space="preserve"> </w:t>
       </w:r>
-      <w:hyperlink r:id="rId73">
+      <w:hyperlink r:id="rId72">
         <w:r>
           <w:rPr>
             <w:rStyle w:val="Hyperlink"/>
@@ -3728,8 +3744,8 @@
         </w:r>
       </w:hyperlink>
     </w:p>
-    <w:bookmarkEnd w:id="74"/>
-    <w:bookmarkStart w:id="76" w:name="ref-papworthEvidenceShiftingBaseline2009"/>
+    <w:bookmarkEnd w:id="73"/>
+    <w:bookmarkStart w:id="75" w:name="ref-papworthEvidenceShiftingBaseline2009"/>
     <w:p>
       <w:pPr>
         <w:pStyle w:val="Bibliography"/>
@@ -3766,7 +3782,7 @@
       <w:r>
         <w:t xml:space="preserve"> </w:t>
       </w:r>
-      <w:hyperlink r:id="rId75">
+      <w:hyperlink r:id="rId74">
         <w:r>
           <w:rPr>
             <w:rStyle w:val="Hyperlink"/>
@@ -3775,8 +3791,8 @@
         </w:r>
       </w:hyperlink>
     </w:p>
-    <w:bookmarkEnd w:id="76"/>
-    <w:bookmarkStart w:id="78" w:name="ref-paulyAnecdotesShiftingBaseline1995"/>
+    <w:bookmarkEnd w:id="75"/>
+    <w:bookmarkStart w:id="77" w:name="ref-paulyAnecdotesShiftingBaseline1995"/>
     <w:p>
       <w:pPr>
         <w:pStyle w:val="Bibliography"/>
@@ -3813,7 +3829,7 @@
       <w:r>
         <w:t xml:space="preserve"> </w:t>
       </w:r>
-      <w:hyperlink r:id="rId77">
+      <w:hyperlink r:id="rId76">
         <w:r>
           <w:rPr>
             <w:rStyle w:val="Hyperlink"/>
@@ -3822,8 +3838,8 @@
         </w:r>
       </w:hyperlink>
     </w:p>
-    <w:bookmarkEnd w:id="78"/>
-    <w:bookmarkStart w:id="80" w:name="X03b217116af5a405b2e157107e6b8a2cfe31837"/>
+    <w:bookmarkEnd w:id="77"/>
+    <w:bookmarkStart w:id="79" w:name="X03b217116af5a405b2e157107e6b8a2cfe31837"/>
     <w:p>
       <w:pPr>
         <w:pStyle w:val="Bibliography"/>
@@ -3850,7 +3866,7 @@
       <w:r>
         <w:t xml:space="preserve"> </w:t>
       </w:r>
-      <w:hyperlink r:id="rId79">
+      <w:hyperlink r:id="rId78">
         <w:r>
           <w:rPr>
             <w:rStyle w:val="Hyperlink"/>
@@ -3859,8 +3875,8 @@
         </w:r>
       </w:hyperlink>
     </w:p>
-    <w:bookmarkEnd w:id="80"/>
-    <w:bookmarkStart w:id="82" w:name="X15453a87abea435588d2bae03c6c13b76a862f1"/>
+    <w:bookmarkEnd w:id="79"/>
+    <w:bookmarkStart w:id="81" w:name="X15453a87abea435588d2bae03c6c13b76a862f1"/>
     <w:p>
       <w:pPr>
         <w:pStyle w:val="Bibliography"/>
@@ -3918,7 +3934,7 @@
       <w:r>
         <w:t xml:space="preserve"> </w:t>
       </w:r>
-      <w:hyperlink r:id="rId81">
+      <w:hyperlink r:id="rId80">
         <w:r>
           <w:rPr>
             <w:rStyle w:val="Hyperlink"/>
@@ -3927,8 +3943,8 @@
         </w:r>
       </w:hyperlink>
     </w:p>
-    <w:bookmarkEnd w:id="82"/>
-    <w:bookmarkStart w:id="84" w:name="ref-sandvikHighSurvivalImmatures2008"/>
+    <w:bookmarkEnd w:id="81"/>
+    <w:bookmarkStart w:id="83" w:name="ref-sandvikHighSurvivalImmatures2008"/>
     <w:p>
       <w:pPr>
         <w:pStyle w:val="Bibliography"/>
@@ -3999,7 +4015,7 @@
       <w:r>
         <w:t xml:space="preserve"> </w:t>
       </w:r>
-      <w:hyperlink r:id="rId83">
+      <w:hyperlink r:id="rId82">
         <w:r>
           <w:rPr>
             <w:rStyle w:val="Hyperlink"/>
@@ -4008,42 +4024,78 @@
         </w:r>
       </w:hyperlink>
     </w:p>
+    <w:bookmarkEnd w:id="83"/>
+    <w:bookmarkStart w:id="84" w:name="X55573da4300cacfc7ebb0f912cf4312ab59c11a"/>
+    <w:p>
+      <w:pPr>
+        <w:pStyle w:val="Bibliography"/>
+      </w:pPr>
+      <w:r>
+        <w:t xml:space="preserve">Stempniewicz, L., &amp; Jensen, J. K. (2007). Puffin harvesting and survival at</w:t>
+      </w:r>
+      <w:r>
+        <w:t xml:space="preserve"> </w:t>
+      </w:r>
+      <w:r>
+        <w:t xml:space="preserve">Nólsoy</w:t>
+      </w:r>
+      <w:r>
+        <w:t xml:space="preserve">, the</w:t>
+      </w:r>
+      <w:r>
+        <w:t xml:space="preserve"> </w:t>
+      </w:r>
+      <w:r>
+        <w:t xml:space="preserve">Faeroes</w:t>
+      </w:r>
+      <w:r>
+        <w:t xml:space="preserve">.</w:t>
+      </w:r>
+      <w:r>
+        <w:t xml:space="preserve"> </w:t>
+      </w:r>
+      <w:r>
+        <w:rPr>
+          <w:i/>
+          <w:iCs/>
+        </w:rPr>
+        <w:t xml:space="preserve">Ornis Svecica</w:t>
+      </w:r>
+      <w:r>
+        <w:t xml:space="preserve">,</w:t>
+      </w:r>
+      <w:r>
+        <w:t xml:space="preserve"> </w:t>
+      </w:r>
+      <w:r>
+        <w:rPr>
+          <w:i/>
+          <w:iCs/>
+        </w:rPr>
+        <w:t xml:space="preserve">17</w:t>
+      </w:r>
+      <w:r>
+        <w:t xml:space="preserve">, 95–99.</w:t>
+      </w:r>
+    </w:p>
     <w:bookmarkEnd w:id="84"/>
-    <w:bookmarkStart w:id="85" w:name="X55573da4300cacfc7ebb0f912cf4312ab59c11a"/>
+    <w:bookmarkStart w:id="86" w:name="X3ede5c96a343fbec70bed9a420846eae3dca84b"/>
     <w:p>
       <w:pPr>
         <w:pStyle w:val="Bibliography"/>
       </w:pPr>
       <w:r>
-        <w:t xml:space="preserve">Stempniewicz, L., &amp; Jensen, J. K. (2007). Puffin harvesting and survival at</w:t>
-      </w:r>
-      <w:r>
-        <w:t xml:space="preserve"> </w:t>
-      </w:r>
-      <w:r>
-        <w:t xml:space="preserve">Nólsoy</w:t>
-      </w:r>
-      <w:r>
-        <w:t xml:space="preserve">, the</w:t>
-      </w:r>
-      <w:r>
-        <w:t xml:space="preserve"> </w:t>
-      </w:r>
-      <w:r>
-        <w:t xml:space="preserve">Faeroes</w:t>
-      </w:r>
-      <w:r>
-        <w:t xml:space="preserve">.</w:t>
-      </w:r>
-      <w:r>
-        <w:t xml:space="preserve"> </w:t>
-      </w:r>
-      <w:r>
-        <w:rPr>
-          <w:i/>
-          <w:iCs/>
-        </w:rPr>
-        <w:t xml:space="preserve">Ornis Svecica</w:t>
+        <w:t xml:space="preserve">Taylor, L. U., &amp; Gnam, E. (2026). Prebreeding populations and the importance of life history for conserving imperiled seabirds.</w:t>
+      </w:r>
+      <w:r>
+        <w:t xml:space="preserve"> </w:t>
+      </w:r>
+      <w:r>
+        <w:rPr>
+          <w:i/>
+          <w:iCs/>
+        </w:rPr>
+        <w:t xml:space="preserve">Frontiers in Ecology and the Environment</w:t>
       </w:r>
       <w:r>
         <w:t xml:space="preserve">,</w:t>
@@ -4056,42 +4108,6 @@
           <w:i/>
           <w:iCs/>
         </w:rPr>
-        <w:t xml:space="preserve">17</w:t>
-      </w:r>
-      <w:r>
-        <w:t xml:space="preserve">, 95–99.</w:t>
-      </w:r>
-    </w:p>
-    <w:bookmarkEnd w:id="85"/>
-    <w:bookmarkStart w:id="87" w:name="X3ede5c96a343fbec70bed9a420846eae3dca84b"/>
-    <w:p>
-      <w:pPr>
-        <w:pStyle w:val="Bibliography"/>
-      </w:pPr>
-      <w:r>
-        <w:t xml:space="preserve">Taylor, L. U., &amp; Gnam, E. (2026). Prebreeding populations and the importance of life history for conserving imperiled seabirds.</w:t>
-      </w:r>
-      <w:r>
-        <w:t xml:space="preserve"> </w:t>
-      </w:r>
-      <w:r>
-        <w:rPr>
-          <w:i/>
-          <w:iCs/>
-        </w:rPr>
-        <w:t xml:space="preserve">Frontiers in Ecology and the Environment</w:t>
-      </w:r>
-      <w:r>
-        <w:t xml:space="preserve">,</w:t>
-      </w:r>
-      <w:r>
-        <w:t xml:space="preserve"> </w:t>
-      </w:r>
-      <w:r>
-        <w:rPr>
-          <w:i/>
-          <w:iCs/>
-        </w:rPr>
         <w:t xml:space="preserve">24</w:t>
       </w:r>
       <w:r>
@@ -4100,7 +4116,7 @@
       <w:r>
         <w:t xml:space="preserve"> </w:t>
       </w:r>
-      <w:hyperlink r:id="rId86">
+      <w:hyperlink r:id="rId85">
         <w:r>
           <w:rPr>
             <w:rStyle w:val="Hyperlink"/>
@@ -4109,8 +4125,8 @@
         </w:r>
       </w:hyperlink>
     </w:p>
-    <w:bookmarkEnd w:id="87"/>
-    <w:bookmarkStart w:id="89" w:name="ref-vanfraneker2004"/>
+    <w:bookmarkEnd w:id="86"/>
+    <w:bookmarkStart w:id="88" w:name="ref-vanfraneker2004"/>
     <w:p>
       <w:pPr>
         <w:pStyle w:val="Bibliography"/>
@@ -4193,7 +4209,7 @@
       <w:r>
         <w:t xml:space="preserve"> </w:t>
       </w:r>
-      <w:hyperlink r:id="rId88">
+      <w:hyperlink r:id="rId87">
         <w:r>
           <w:rPr>
             <w:rStyle w:val="Hyperlink"/>
@@ -4202,8 +4218,8 @@
         </w:r>
       </w:hyperlink>
     </w:p>
-    <w:bookmarkEnd w:id="89"/>
-    <w:bookmarkStart w:id="91" w:name="ref-vehtariPracticalBayesianModel2017"/>
+    <w:bookmarkEnd w:id="88"/>
+    <w:bookmarkStart w:id="90" w:name="ref-vehtariPracticalBayesianModel2017"/>
     <w:p>
       <w:pPr>
         <w:pStyle w:val="Bibliography"/>
@@ -4261,7 +4277,7 @@
       <w:r>
         <w:t xml:space="preserve"> </w:t>
       </w:r>
-      <w:hyperlink r:id="rId90">
+      <w:hyperlink r:id="rId89">
         <w:r>
           <w:rPr>
             <w:rStyle w:val="Hyperlink"/>
@@ -4270,8 +4286,8 @@
         </w:r>
       </w:hyperlink>
     </w:p>
-    <w:bookmarkEnd w:id="91"/>
-    <w:bookmarkStart w:id="93" w:name="Xb381b5d8d6d3401bbb0133a1c086c6f6782b533"/>
+    <w:bookmarkEnd w:id="90"/>
+    <w:bookmarkStart w:id="92" w:name="Xb381b5d8d6d3401bbb0133a1c086c6f6782b533"/>
     <w:p>
       <w:pPr>
         <w:pStyle w:val="Bibliography"/>
@@ -4332,7 +4348,7 @@
       <w:r>
         <w:t xml:space="preserve"> </w:t>
       </w:r>
-      <w:hyperlink r:id="rId92">
+      <w:hyperlink r:id="rId91">
         <w:r>
           <w:rPr>
             <w:rStyle w:val="Hyperlink"/>
@@ -4341,44 +4357,44 @@
         </w:r>
       </w:hyperlink>
     </w:p>
+    <w:bookmarkEnd w:id="92"/>
+    <w:bookmarkStart w:id="93" w:name="ref-vehtariParetoSmoothedImportance2024"/>
+    <w:p>
+      <w:pPr>
+        <w:pStyle w:val="Bibliography"/>
+      </w:pPr>
+      <w:r>
+        <w:t xml:space="preserve">Vehtari, A., Simpson, D., Gelman, A., Yao, Y., &amp; Gabry, J. (2024). Pareto smoothed importance sampling.</w:t>
+      </w:r>
+      <w:r>
+        <w:t xml:space="preserve"> </w:t>
+      </w:r>
+      <w:r>
+        <w:rPr>
+          <w:i/>
+          <w:iCs/>
+        </w:rPr>
+        <w:t xml:space="preserve">Journal of Machine Learning Research</w:t>
+      </w:r>
+      <w:r>
+        <w:t xml:space="preserve">,</w:t>
+      </w:r>
+      <w:r>
+        <w:t xml:space="preserve"> </w:t>
+      </w:r>
+      <w:r>
+        <w:rPr>
+          <w:i/>
+          <w:iCs/>
+        </w:rPr>
+        <w:t xml:space="preserve">25</w:t>
+      </w:r>
+      <w:r>
+        <w:t xml:space="preserve">(72), 1–58.</w:t>
+      </w:r>
+    </w:p>
     <w:bookmarkEnd w:id="93"/>
-    <w:bookmarkStart w:id="94" w:name="ref-vehtariParetoSmoothedImportance2024"/>
-    <w:p>
-      <w:pPr>
-        <w:pStyle w:val="Bibliography"/>
-      </w:pPr>
-      <w:r>
-        <w:t xml:space="preserve">Vehtari, A., Simpson, D., Gelman, A., Yao, Y., &amp; Gabry, J. (2024). Pareto smoothed importance sampling.</w:t>
-      </w:r>
-      <w:r>
-        <w:t xml:space="preserve"> </w:t>
-      </w:r>
-      <w:r>
-        <w:rPr>
-          <w:i/>
-          <w:iCs/>
-        </w:rPr>
-        <w:t xml:space="preserve">Journal of Machine Learning Research</w:t>
-      </w:r>
-      <w:r>
-        <w:t xml:space="preserve">,</w:t>
-      </w:r>
-      <w:r>
-        <w:t xml:space="preserve"> </w:t>
-      </w:r>
-      <w:r>
-        <w:rPr>
-          <w:i/>
-          <w:iCs/>
-        </w:rPr>
-        <w:t xml:space="preserve">25</w:t>
-      </w:r>
-      <w:r>
-        <w:t xml:space="preserve">(72), 1–58.</w:t>
-      </w:r>
-    </w:p>
     <w:bookmarkEnd w:id="94"/>
-    <w:bookmarkEnd w:id="95"/>
     <w:p>
       <w:r>
         <w:br w:type="page"/>
@@ -4502,30 +4518,30 @@
       <w:tr>
         <w:tc>
           <w:tcPr/>
-          <w:bookmarkStart w:id="100" w:name="fig-map"/>
+          <w:bookmarkStart w:id="99" w:name="fig-map"/>
           <w:p>
             <w:pPr>
               <w:pStyle w:val="Compact"/>
               <w:jc w:val="center"/>
             </w:pPr>
-            <w:bookmarkStart w:id="99" w:name="fig-map"/>
+            <w:bookmarkStart w:id="98" w:name="fig-map"/>
             <w:r>
               <w:drawing>
                 <wp:inline>
                   <wp:extent cx="5943600" cy="6028508"/>
                   <wp:effectExtent b="0" l="0" r="0" t="0"/>
-                  <wp:docPr descr="" title="" id="97" name="Picture"/>
+                  <wp:docPr descr="" title="" id="96" name="Picture"/>
                   <a:graphic>
                     <a:graphicData uri="http://schemas.openxmlformats.org/drawingml/2006/picture">
                       <pic:pic>
                         <pic:nvPicPr>
-                          <pic:cNvPr descr="manuscript_files/figure-docx/fig-map-1.png" id="98" name="Picture"/>
+                          <pic:cNvPr descr="manuscript_files/figure-docx/fig-map-1.png" id="97" name="Picture"/>
                           <pic:cNvPicPr>
                             <a:picLocks noChangeArrowheads="1" noChangeAspect="1"/>
                           </pic:cNvPicPr>
                         </pic:nvPicPr>
                         <pic:blipFill>
-                          <a:blip r:embed="rId96"/>
+                          <a:blip r:embed="rId95"/>
                           <a:stretch>
                             <a:fillRect/>
                           </a:stretch>
@@ -4551,7 +4567,7 @@
                 </wp:inline>
               </w:drawing>
             </w:r>
-            <w:bookmarkEnd w:id="99"/>
+            <w:bookmarkEnd w:id="98"/>
           </w:p>
           <w:p>
             <w:pPr>
@@ -4570,7 +4586,7 @@
               <w:t xml:space="preserve"> 1</w:t>
             </w:r>
           </w:p>
-          <w:bookmarkEnd w:id="100"/>
+          <w:bookmarkEnd w:id="99"/>
         </w:tc>
       </w:tr>
     </w:tbl>
@@ -4592,30 +4608,30 @@
       <w:tr>
         <w:tc>
           <w:tcPr/>
-          <w:bookmarkStart w:id="105" w:name="fig-marg-bar"/>
+          <w:bookmarkStart w:id="104" w:name="fig-marg-bar"/>
           <w:p>
             <w:pPr>
               <w:pStyle w:val="Compact"/>
               <w:jc w:val="center"/>
             </w:pPr>
-            <w:bookmarkStart w:id="104" w:name="fig-marg-bar"/>
+            <w:bookmarkStart w:id="103" w:name="fig-marg-bar"/>
             <w:r>
               <w:drawing>
                 <wp:inline>
                   <wp:extent cx="5943600" cy="4245428"/>
                   <wp:effectExtent b="0" l="0" r="0" t="0"/>
-                  <wp:docPr descr="" title="" id="102" name="Picture"/>
+                  <wp:docPr descr="" title="" id="101" name="Picture"/>
                   <a:graphic>
                     <a:graphicData uri="http://schemas.openxmlformats.org/drawingml/2006/picture">
                       <pic:pic>
                         <pic:nvPicPr>
-                          <pic:cNvPr descr="manuscript_files/figure-docx/fig-marg-bar-1.png" id="103" name="Picture"/>
+                          <pic:cNvPr descr="manuscript_files/figure-docx/fig-marg-bar-1.png" id="102" name="Picture"/>
                           <pic:cNvPicPr>
                             <a:picLocks noChangeArrowheads="1" noChangeAspect="1"/>
                           </pic:cNvPicPr>
                         </pic:nvPicPr>
                         <pic:blipFill>
-                          <a:blip r:embed="rId101"/>
+                          <a:blip r:embed="rId100"/>
                           <a:stretch>
                             <a:fillRect/>
                           </a:stretch>
@@ -4641,7 +4657,7 @@
                 </wp:inline>
               </w:drawing>
             </w:r>
-            <w:bookmarkEnd w:id="104"/>
+            <w:bookmarkEnd w:id="103"/>
           </w:p>
           <w:p>
             <w:pPr>
@@ -4660,7 +4676,7 @@
               <w:t xml:space="preserve"> 2</w:t>
             </w:r>
           </w:p>
-          <w:bookmarkEnd w:id="105"/>
+          <w:bookmarkEnd w:id="104"/>
         </w:tc>
       </w:tr>
     </w:tbl>
@@ -4682,30 +4698,30 @@
       <w:tr>
         <w:tc>
           <w:tcPr/>
-          <w:bookmarkStart w:id="110" w:name="fig-pred1"/>
+          <w:bookmarkStart w:id="109" w:name="fig-pred1"/>
           <w:p>
             <w:pPr>
               <w:pStyle w:val="Compact"/>
               <w:jc w:val="center"/>
             </w:pPr>
-            <w:bookmarkStart w:id="109" w:name="fig-pred1"/>
+            <w:bookmarkStart w:id="108" w:name="fig-pred1"/>
             <w:r>
               <w:drawing>
                 <wp:inline>
                   <wp:extent cx="5943600" cy="4245428"/>
                   <wp:effectExtent b="0" l="0" r="0" t="0"/>
-                  <wp:docPr descr="" title="" id="107" name="Picture"/>
+                  <wp:docPr descr="" title="" id="106" name="Picture"/>
                   <a:graphic>
                     <a:graphicData uri="http://schemas.openxmlformats.org/drawingml/2006/picture">
                       <pic:pic>
                         <pic:nvPicPr>
-                          <pic:cNvPr descr="manuscript_files/figure-docx/fig-pred1-1.png" id="108" name="Picture"/>
+                          <pic:cNvPr descr="manuscript_files/figure-docx/fig-pred1-1.png" id="107" name="Picture"/>
                           <pic:cNvPicPr>
                             <a:picLocks noChangeArrowheads="1" noChangeAspect="1"/>
                           </pic:cNvPicPr>
                         </pic:nvPicPr>
                         <pic:blipFill>
-                          <a:blip r:embed="rId106"/>
+                          <a:blip r:embed="rId105"/>
                           <a:stretch>
                             <a:fillRect/>
                           </a:stretch>
@@ -4731,7 +4747,7 @@
                 </wp:inline>
               </w:drawing>
             </w:r>
-            <w:bookmarkEnd w:id="109"/>
+            <w:bookmarkEnd w:id="108"/>
           </w:p>
           <w:p>
             <w:pPr>
@@ -4750,7 +4766,7 @@
               <w:t xml:space="preserve"> 3</w:t>
             </w:r>
           </w:p>
-          <w:bookmarkEnd w:id="110"/>
+          <w:bookmarkEnd w:id="109"/>
         </w:tc>
       </w:tr>
     </w:tbl>
@@ -4772,30 +4788,30 @@
       <w:tr>
         <w:tc>
           <w:tcPr/>
-          <w:bookmarkStart w:id="115" w:name="fig-pred2"/>
+          <w:bookmarkStart w:id="114" w:name="fig-pred2"/>
           <w:p>
             <w:pPr>
               <w:pStyle w:val="Compact"/>
               <w:jc w:val="center"/>
             </w:pPr>
-            <w:bookmarkStart w:id="114" w:name="fig-pred2"/>
+            <w:bookmarkStart w:id="113" w:name="fig-pred2"/>
             <w:r>
               <w:drawing>
                 <wp:inline>
                   <wp:extent cx="5943600" cy="4245428"/>
                   <wp:effectExtent b="0" l="0" r="0" t="0"/>
-                  <wp:docPr descr="" title="" id="112" name="Picture"/>
+                  <wp:docPr descr="" title="" id="111" name="Picture"/>
                   <a:graphic>
                     <a:graphicData uri="http://schemas.openxmlformats.org/drawingml/2006/picture">
                       <pic:pic>
                         <pic:nvPicPr>
-                          <pic:cNvPr descr="manuscript_files/figure-docx/fig-pred2-1.png" id="113" name="Picture"/>
+                          <pic:cNvPr descr="manuscript_files/figure-docx/fig-pred2-1.png" id="112" name="Picture"/>
                           <pic:cNvPicPr>
                             <a:picLocks noChangeArrowheads="1" noChangeAspect="1"/>
                           </pic:cNvPicPr>
                         </pic:nvPicPr>
                         <pic:blipFill>
-                          <a:blip r:embed="rId111"/>
+                          <a:blip r:embed="rId110"/>
                           <a:stretch>
                             <a:fillRect/>
                           </a:stretch>
@@ -4821,7 +4837,7 @@
                 </wp:inline>
               </w:drawing>
             </w:r>
-            <w:bookmarkEnd w:id="114"/>
+            <w:bookmarkEnd w:id="113"/>
           </w:p>
           <w:p>
             <w:pPr>
@@ -4840,7 +4856,7 @@
               <w:t xml:space="preserve"> 4</w:t>
             </w:r>
           </w:p>
-          <w:bookmarkEnd w:id="115"/>
+          <w:bookmarkEnd w:id="114"/>
         </w:tc>
       </w:tr>
     </w:tbl>
@@ -4862,7 +4878,7 @@
       <w:tr>
         <w:tc>
           <w:tcPr/>
-          <w:bookmarkStart w:id="116" w:name="tbl-harvest"/>
+          <w:bookmarkStart w:id="115" w:name="tbl-harvest"/>
           <w:p>
             <w:pPr xmlns:w="http://schemas.openxmlformats.org/wordprocessingml/2006/main">
               <w:pStyle xmlns:w="http://schemas.openxmlformats.org/wordprocessingml/2006/main" w:val="ImageCaption"/>
@@ -6639,7 +6655,7 @@
               </w:tc>
             </w:tr>
           </w:tbl>
-          <w:bookmarkEnd w:id="116"/>
+          <w:bookmarkEnd w:id="115"/>
           <w:p/>
         </w:tc>
       </w:tr>
@@ -6704,7 +6720,7 @@
       <w:tr>
         <w:tc>
           <w:tcPr/>
-          <w:bookmarkStart w:id="117" w:name="tbl-odds1"/>
+          <w:bookmarkStart w:id="116" w:name="tbl-odds1"/>
           <w:p>
             <w:pPr xmlns:w="http://schemas.openxmlformats.org/wordprocessingml/2006/main">
               <w:pStyle xmlns:w="http://schemas.openxmlformats.org/wordprocessingml/2006/main" w:val="ImageCaption"/>
@@ -7049,7 +7065,7 @@
               </w:tc>
             </w:tr>
           </w:tbl>
-          <w:bookmarkEnd w:id="117"/>
+          <w:bookmarkEnd w:id="116"/>
           <w:p/>
         </w:tc>
       </w:tr>
@@ -7071,7 +7087,7 @@
         <w:t xml:space="preserve">The model included breeding status (0 = never bred, 1 = has bred) as response variable, and year, brood patches (0 = absent, 1 = present), and their interaction as covariates.</w:t>
       </w:r>
     </w:p>
-    <w:bookmarkEnd w:id="118"/>
+    <w:bookmarkEnd w:id="117"/>
     <w:sectPr>
       <w:type w:val="continuous"/>
       <w:pgSz w:h="15840" w:w="12240"/>

</xml_diff>